<commit_message>
Update MNIST_kNN_设计报告_最终提交版.docx with original error neighbors strip and student voice
</commit_message>
<xml_diff>
--- a/MNIST_kNN_设计报告_最终提交版.docx
+++ b/MNIST_kNN_设计报告_最终提交版.docx
@@ -5665,7 +5665,7 @@
           <w:sz w:val="19"/>
           <w:szCs w:val="19"/>
         </w:rPr>
-        <w:t>计算全量 10,000 张测试集 10×10 混淆矩阵，并对 317 个错误样本（3.17%）及近邻进行检索与可视化归因。</w:t>
+        <w:t>为探究模型在测试集上的判别瓶颈，实验计算了全量 10,000 张测试集的 10×10 混淆矩阵，并对 317 个错误样本（3.17% 误判率）提取前 5 个训练集近邻进行可视化溯源分析。</w:t>
       </w:r>
     </w:p>
     <w:p>
@@ -5682,7 +5682,7 @@
         <w:t/>
         <w:drawing>
           <wp:inline distT="0" distB="0" distL="0" distR="0">
-            <wp:extent cx="3302000" cy="2933511"/>
+            <wp:extent cx="2794000" cy="2482202"/>
             <wp:docPr id="106" name="01_confusion.png"/>
             <a:graphic>
               <a:graphicData uri="http://schemas.openxmlformats.org/drawingml/2006/picture">
@@ -5700,7 +5700,7 @@
                   <pic:spPr>
                     <a:xfrm>
                       <a:off x="0" y="0"/>
-                      <a:ext cx="3302000" cy="2933511"/>
+                      <a:ext cx="2794000" cy="2482202"/>
                     </a:xfrm>
                     <a:prstGeom prst="rect">
                       <a:avLst/>
@@ -5740,330 +5740,13 @@
           <w:color w:val="0F172A"/>
           <w:b/>
         </w:rPr>
-        <w:t>7.1 高频有向混淆对统计与成因解释</w:t>
-      </w:r>
-    </w:p>
-    <w:tbl>
-      <w:tblPr>
-        <w:tblW w:w="8300" w:type="dxa"/>
-        <w:tblLayout w:type="fixed"/>
-        <w:tblBorders>
-          <w:top w:val="single" w:sz="8" w:color="1E293B"/>
-          <w:bottom w:val="single" w:sz="8" w:color="1E293B"/>
-          <w:insideH w:val="single" w:sz="4" w:color="E2E8F0"/>
-        </w:tblBorders>
-        <w:tblCellMar>
-          <w:top w:w="50" w:type="dxa"/>
-          <w:bottom w:w="50" w:type="dxa"/>
-          <w:left w:w="50" w:type="dxa"/>
-          <w:right w:w="50" w:type="dxa"/>
-        </w:tblCellMar>
-      </w:tblPr>
-      <w:tblGrid>
-        <w:gridCol w:w="1600"/>
-        <w:gridCol w:w="1200"/>
-        <w:gridCol w:w="5500"/>
-      </w:tblGrid>
-      <w:tr>
-        <w:tc>
-          <w:tcPr>
-            <w:tcW w:w="1600" w:type="dxa"/>
-            <w:shd w:fill="1E3A8A"/>
-          </w:tcPr>
-          <w:p>
-            <w:pPr>
-              <w:spacing w:after="0" w:before="0" w:line="200" w:lineRule="auto"/>
-              <w:jc w:val="left"/>
-            </w:pPr>
-            <w:r>
-              <w:rPr>
-                <w:rFonts w:ascii="SimHei" w:hAnsi="SimHei" w:eastAsia="SimHei"/>
-                <w:sz w:val="15"/>
-                <w:b/>
-                <w:color w:val="FFFFFF"/>
-              </w:rPr>
-              <w:t>易混淆样本对</w:t>
-            </w:r>
-          </w:p>
-        </w:tc>
-        <w:tc>
-          <w:tcPr>
-            <w:tcW w:w="1200" w:type="dxa"/>
-            <w:shd w:fill="1E3A8A"/>
-          </w:tcPr>
-          <w:p>
-            <w:pPr>
-              <w:spacing w:after="0" w:before="0" w:line="200" w:lineRule="auto"/>
-              <w:jc w:val="center"/>
-            </w:pPr>
-            <w:r>
-              <w:rPr>
-                <w:rFonts w:ascii="SimHei" w:hAnsi="SimHei" w:eastAsia="SimHei"/>
-                <w:sz w:val="15"/>
-                <w:b/>
-                <w:color w:val="FFFFFF"/>
-              </w:rPr>
-              <w:t>误判数量</w:t>
-            </w:r>
-          </w:p>
-        </w:tc>
-        <w:tc>
-          <w:tcPr>
-            <w:tcW w:w="5500" w:type="dxa"/>
-            <w:shd w:fill="1E3A8A"/>
-          </w:tcPr>
-          <w:p>
-            <w:pPr>
-              <w:spacing w:after="0" w:before="0" w:line="200" w:lineRule="auto"/>
-              <w:jc w:val="center"/>
-            </w:pPr>
-            <w:r>
-              <w:rPr>
-                <w:rFonts w:ascii="SimHei" w:hAnsi="SimHei" w:eastAsia="SimHei"/>
-                <w:sz w:val="15"/>
-                <w:b/>
-                <w:color w:val="FFFFFF"/>
-              </w:rPr>
-              <w:t>形态学成因与特征重叠解释</w:t>
-            </w:r>
-          </w:p>
-        </w:tc>
-      </w:tr>
-      <w:tr>
-        <w:tc>
-          <w:tcPr>
-            <w:tcW w:w="1600" w:type="dxa"/>
-          </w:tcPr>
-          <w:p>
-            <w:pPr>
-              <w:spacing w:after="0" w:before="0" w:line="200" w:lineRule="auto"/>
-              <w:jc w:val="left"/>
-            </w:pPr>
-            <w:r>
-              <w:rPr>
-                <w:rFonts w:ascii="Times New Roman" w:hAnsi="Times New Roman" w:eastAsia="SimSun"/>
-                <w:sz w:val="15"/>
-              </w:rPr>
-              <w:t>4 → 9</w:t>
-            </w:r>
-          </w:p>
-        </w:tc>
-        <w:tc>
-          <w:tcPr>
-            <w:tcW w:w="1200" w:type="dxa"/>
-          </w:tcPr>
-          <w:p>
-            <w:pPr>
-              <w:spacing w:after="0" w:before="0" w:line="200" w:lineRule="auto"/>
-              <w:jc w:val="center"/>
-            </w:pPr>
-            <w:r>
-              <w:rPr>
-                <w:rFonts w:ascii="Times New Roman" w:hAnsi="Times New Roman" w:eastAsia="SimSun"/>
-                <w:sz w:val="15"/>
-              </w:rPr>
-              <w:t>45 张</w:t>
-            </w:r>
-          </w:p>
-        </w:tc>
-        <w:tc>
-          <w:tcPr>
-            <w:tcW w:w="5500" w:type="dxa"/>
-          </w:tcPr>
-          <w:p>
-            <w:pPr>
-              <w:spacing w:after="0" w:before="0" w:line="200" w:lineRule="auto"/>
-              <w:jc w:val="center"/>
-            </w:pPr>
-            <w:r>
-              <w:rPr>
-                <w:rFonts w:ascii="Times New Roman" w:hAnsi="Times New Roman" w:eastAsia="SimSun"/>
-                <w:sz w:val="15"/>
-              </w:rPr>
-              <w:t>书写 4 时顶部闭合回折，局部梯度与倾斜的 9 几乎完全同构</w:t>
-            </w:r>
-          </w:p>
-        </w:tc>
-      </w:tr>
-      <w:tr>
-        <w:tc>
-          <w:tcPr>
-            <w:tcW w:w="1600" w:type="dxa"/>
-            <w:shd w:fill="F8FAFC"/>
-          </w:tcPr>
-          <w:p>
-            <w:pPr>
-              <w:spacing w:after="0" w:before="0" w:line="200" w:lineRule="auto"/>
-              <w:jc w:val="left"/>
-            </w:pPr>
-            <w:r>
-              <w:rPr>
-                <w:rFonts w:ascii="Times New Roman" w:hAnsi="Times New Roman" w:eastAsia="SimSun"/>
-                <w:sz w:val="15"/>
-              </w:rPr>
-              <w:t>7 → 9</w:t>
-            </w:r>
-          </w:p>
-        </w:tc>
-        <w:tc>
-          <w:tcPr>
-            <w:tcW w:w="1200" w:type="dxa"/>
-            <w:shd w:fill="F8FAFC"/>
-          </w:tcPr>
-          <w:p>
-            <w:pPr>
-              <w:spacing w:after="0" w:before="0" w:line="200" w:lineRule="auto"/>
-              <w:jc w:val="center"/>
-            </w:pPr>
-            <w:r>
-              <w:rPr>
-                <w:rFonts w:ascii="Times New Roman" w:hAnsi="Times New Roman" w:eastAsia="SimSun"/>
-                <w:sz w:val="15"/>
-              </w:rPr>
-              <w:t>21 张</w:t>
-            </w:r>
-          </w:p>
-        </w:tc>
-        <w:tc>
-          <w:tcPr>
-            <w:tcW w:w="5500" w:type="dxa"/>
-            <w:shd w:fill="F8FAFC"/>
-          </w:tcPr>
-          <w:p>
-            <w:pPr>
-              <w:spacing w:after="0" w:before="0" w:line="200" w:lineRule="auto"/>
-              <w:jc w:val="center"/>
-            </w:pPr>
-            <w:r>
-              <w:rPr>
-                <w:rFonts w:ascii="Times New Roman" w:hAnsi="Times New Roman" w:eastAsia="SimSun"/>
-                <w:sz w:val="15"/>
-              </w:rPr>
-              <w:t>书写 7 时横画向左下大弧度弯折或带中横杠，形成封闭环伪特征</w:t>
-            </w:r>
-          </w:p>
-        </w:tc>
-      </w:tr>
-      <w:tr>
-        <w:tc>
-          <w:tcPr>
-            <w:tcW w:w="1600" w:type="dxa"/>
-          </w:tcPr>
-          <w:p>
-            <w:pPr>
-              <w:spacing w:after="0" w:before="0" w:line="200" w:lineRule="auto"/>
-              <w:jc w:val="left"/>
-            </w:pPr>
-            <w:r>
-              <w:rPr>
-                <w:rFonts w:ascii="Times New Roman" w:hAnsi="Times New Roman" w:eastAsia="SimSun"/>
-                <w:sz w:val="15"/>
-              </w:rPr>
-              <w:t>5 → 3</w:t>
-            </w:r>
-          </w:p>
-        </w:tc>
-        <w:tc>
-          <w:tcPr>
-            <w:tcW w:w="1200" w:type="dxa"/>
-          </w:tcPr>
-          <w:p>
-            <w:pPr>
-              <w:spacing w:after="0" w:before="0" w:line="200" w:lineRule="auto"/>
-              <w:jc w:val="center"/>
-            </w:pPr>
-            <w:r>
-              <w:rPr>
-                <w:rFonts w:ascii="Times New Roman" w:hAnsi="Times New Roman" w:eastAsia="SimSun"/>
-                <w:sz w:val="15"/>
-              </w:rPr>
-              <w:t>14 张</w:t>
-            </w:r>
-          </w:p>
-        </w:tc>
-        <w:tc>
-          <w:tcPr>
-            <w:tcW w:w="5500" w:type="dxa"/>
-          </w:tcPr>
-          <w:p>
-            <w:pPr>
-              <w:spacing w:after="0" w:before="0" w:line="200" w:lineRule="auto"/>
-              <w:jc w:val="center"/>
-            </w:pPr>
-            <w:r>
-              <w:rPr>
-                <w:rFonts w:ascii="Times New Roman" w:hAnsi="Times New Roman" w:eastAsia="SimSun"/>
-                <w:sz w:val="15"/>
-              </w:rPr>
-              <w:t>手写 5 的上横与竖画断开，下方半圆与数字 3 的下半弧严重重叠</w:t>
-            </w:r>
-          </w:p>
-        </w:tc>
-      </w:tr>
-      <w:tr>
-        <w:tc>
-          <w:tcPr>
-            <w:tcW w:w="1600" w:type="dxa"/>
-            <w:shd w:fill="F8FAFC"/>
-          </w:tcPr>
-          <w:p>
-            <w:pPr>
-              <w:spacing w:after="0" w:before="0" w:line="200" w:lineRule="auto"/>
-              <w:jc w:val="left"/>
-            </w:pPr>
-            <w:r>
-              <w:rPr>
-                <w:rFonts w:ascii="Times New Roman" w:hAnsi="Times New Roman" w:eastAsia="SimSun"/>
-                <w:sz w:val="15"/>
-              </w:rPr>
-              <w:t>9 → 3</w:t>
-            </w:r>
-          </w:p>
-        </w:tc>
-        <w:tc>
-          <w:tcPr>
-            <w:tcW w:w="1200" w:type="dxa"/>
-            <w:shd w:fill="F8FAFC"/>
-          </w:tcPr>
-          <w:p>
-            <w:pPr>
-              <w:spacing w:after="0" w:before="0" w:line="200" w:lineRule="auto"/>
-              <w:jc w:val="center"/>
-            </w:pPr>
-            <w:r>
-              <w:rPr>
-                <w:rFonts w:ascii="Times New Roman" w:hAnsi="Times New Roman" w:eastAsia="SimSun"/>
-                <w:sz w:val="15"/>
-              </w:rPr>
-              <w:t>13 张</w:t>
-            </w:r>
-          </w:p>
-        </w:tc>
-        <w:tc>
-          <w:tcPr>
-            <w:tcW w:w="5500" w:type="dxa"/>
-            <w:shd w:fill="F8FAFC"/>
-          </w:tcPr>
-          <w:p>
-            <w:pPr>
-              <w:spacing w:after="0" w:before="0" w:line="200" w:lineRule="auto"/>
-              <w:jc w:val="center"/>
-            </w:pPr>
-            <w:r>
-              <w:rPr>
-                <w:rFonts w:ascii="Times New Roman" w:hAnsi="Times New Roman" w:eastAsia="SimSun"/>
-                <w:sz w:val="15"/>
-              </w:rPr>
-              <w:t>手写 9 头部开裂且下半笔顺弯曲，近邻检索落入 3 的聚集区</w:t>
-            </w:r>
-          </w:p>
-        </w:tc>
-      </w:tr>
-    </w:tbl>
-    <w:p>
-      <w:pPr>
-        <w:spacing w:after="30" w:line="240" w:lineRule="auto"/>
-        <w:jc w:val="left"/>
+        <w:t>7.1 典型误分类样本与训练集近邻对比</w:t>
+      </w:r>
+    </w:p>
+    <w:p>
+      <w:pPr>
+        <w:spacing w:after="20" w:line="240" w:lineRule="auto"/>
+        <w:jc w:val="center"/>
       </w:pPr>
       <w:r>
         <w:rPr>
@@ -6072,6 +5755,67 @@
           <w:szCs w:val="20"/>
         </w:rPr>
         <w:t/>
+        <w:drawing>
+          <wp:inline distT="0" distB="0" distL="0" distR="0">
+            <wp:extent cx="5334000" cy="2477354"/>
+            <wp:docPr id="107" name="04_error_neighbors_compact.png"/>
+            <a:graphic>
+              <a:graphicData uri="http://schemas.openxmlformats.org/drawingml/2006/picture">
+                <pic:pic>
+                  <pic:nvPicPr>
+                    <pic:cNvPr id="0" name="04_error_neighbors_compact.png"/>
+                    <pic:cNvPicPr/>
+                  </pic:nvPicPr>
+                  <pic:blipFill>
+                    <a:blip r:embed="rId12"/>
+                    <a:stretch>
+                      <a:fillRect/>
+                    </a:stretch>
+                  </pic:blipFill>
+                  <pic:spPr>
+                    <a:xfrm>
+                      <a:off x="0" y="0"/>
+                      <a:ext cx="5334000" cy="2477354"/>
+                    </a:xfrm>
+                    <a:prstGeom prst="rect">
+                      <a:avLst/>
+                    </a:prstGeom>
+                  </pic:spPr>
+                </pic:pic>
+              </a:graphicData>
+            </a:graphic>
+          </wp:inline>
+        </w:drawing>
+      </w:r>
+    </w:p>
+    <w:p>
+      <w:pPr>
+        <w:spacing w:after="30" w:line="240" w:lineRule="auto"/>
+        <w:jc w:val="left"/>
+      </w:pPr>
+      <w:r>
+        <w:rPr>
+          <w:rFonts w:ascii="Times New Roman" w:hAnsi="Times New Roman" w:eastAsia="SimSun"/>
+          <w:sz w:val="17"/>
+          <w:szCs w:val="17"/>
+        </w:rPr>
+        <w:t>图 4：典型高频混淆测试样本（红）与其前 5 个训练集近邻图谱（绿为同类，红为异类）</w:t>
+      </w:r>
+    </w:p>
+    <w:p>
+      <w:pPr>
+        <w:spacing w:after="40" w:line="240" w:lineRule="auto"/>
+        <w:jc w:val="left"/>
+      </w:pPr>
+      <w:r>
+        <w:rPr>
+          <w:rFonts w:ascii="SimHei" w:hAnsi="SimHei" w:eastAsia="SimHei"/>
+          <w:sz w:val="21"/>
+          <w:szCs w:val="21"/>
+          <w:color w:val="0F172A"/>
+          <w:b/>
+        </w:rPr>
+        <w:t>7.2 高频有向混淆成因分析</w:t>
       </w:r>
     </w:p>
     <w:p>
@@ -6086,7 +5830,37 @@
           <w:sz w:val="19"/>
           <w:szCs w:val="19"/>
         </w:rPr>
-        <w:t>归因诊断：误分类多源于书写粘连或笔画形变。kNN 作为非参数记忆型分类器，完全受制于局部流形密度，在两类交界模糊带易受局部偏差误导。</w:t>
+        <w:t>• 4 → 9（45例）：书写 4 时顶部闭合回折，局部梯度特征与倾斜书写的 9 高度同构，导致多数近邻均被判定为 9。</w:t>
+      </w:r>
+    </w:p>
+    <w:p>
+      <w:pPr>
+        <w:spacing w:after="40" w:line="240" w:lineRule="auto"/>
+        <w:jc w:val="left"/>
+        <w:ind w:firstLineChars="200" w:firstLine="420"/>
+      </w:pPr>
+      <w:r>
+        <w:rPr>
+          <w:rFonts w:ascii="Times New Roman" w:hAnsi="Times New Roman" w:eastAsia="SimSun"/>
+          <w:sz w:val="19"/>
+          <w:szCs w:val="19"/>
+        </w:rPr>
+        <w:t>• 7 → 9（21例）与 5 → 3（14例）：手写 7 带有中横杠或大弧度弯折，形成封闭环伪特征；手写 5 的上横与竖画断开，下方半圆与 3 的圆弧高度重合。</w:t>
+      </w:r>
+    </w:p>
+    <w:p>
+      <w:pPr>
+        <w:spacing w:after="40" w:line="240" w:lineRule="auto"/>
+        <w:jc w:val="left"/>
+        <w:ind w:firstLineChars="200" w:firstLine="420"/>
+      </w:pPr>
+      <w:r>
+        <w:rPr>
+          <w:rFonts w:ascii="Times New Roman" w:hAnsi="Times New Roman" w:eastAsia="SimSun"/>
+          <w:sz w:val="19"/>
+          <w:szCs w:val="19"/>
+        </w:rPr>
+        <w:t>• 局限性：kNN 属于基于局部流形密度的记忆型分类器，在两类交界重叠区域容易受局部样本噪声误导。</w:t>
       </w:r>
     </w:p>
     <w:p>
@@ -6106,7 +5880,7 @@
           <w:color w:val="0F172A"/>
           <w:b/>
         </w:rPr>
-        <w:t>八、总结讨论、QA 验证与在线源码仓库</w:t>
+        <w:t>八、总结讨论、算法 QA 验证与工程复现</w:t>
       </w:r>
     </w:p>
     <w:p>
@@ -6121,7 +5895,7 @@
           <w:sz w:val="19"/>
           <w:szCs w:val="19"/>
         </w:rPr>
-        <w:t>本实验完成了从数据预处理、SVD PCA 降维、分批向量化、100 组参数搜索到全量测试的闭环。在 MNIST 10,000 张测试集上取得 96.83% 准确率，充分验证了向量化 kNN 与 HOG 特征在手写体识别任务上的实用价值。</w:t>
+        <w:t>本课程设计完整实现了从原始 IDX 数据无损预处理、中心化 SVD PCA 降维、局部梯度 HOG 提取、分批向量化矩阵检索、100 组超参数无偏搜索到独立全量测试的闭环。在全量 10,000 张测试集上达到 96.83% Top-1 识别率，且 GPU 分批检索耗时仅 2.53 秒，充分验证了向量化 kNN 在手写数字识别任务上的有效性与工程效率。</w:t>
       </w:r>
     </w:p>
     <w:p>
@@ -6137,7 +5911,7 @@
           <w:color w:val="0F172A"/>
           <w:b/>
         </w:rPr>
-        <w:t>8.1 算法 QA 验证清单与交付完整性</w:t>
+        <w:t>8.1 算法单元测试与科学性验证</w:t>
       </w:r>
     </w:p>
     <w:tbl>
@@ -6200,7 +5974,7 @@
                 <w:b/>
                 <w:color w:val="FFFFFF"/>
               </w:rPr>
-              <w:t>检验依据与方法</w:t>
+              <w:t>检验依据与验证方法</w:t>
             </w:r>
           </w:p>
         </w:tc>
@@ -6298,7 +6072,7 @@
                 <w:rFonts w:ascii="Times New Roman" w:hAnsi="Times New Roman" w:eastAsia="SimSun"/>
                 <w:sz w:val="15"/>
               </w:rPr>
-              <w:t>10 组 sklearn 对照</w:t>
+              <w:t>10 组 sklearn 交叉验证</w:t>
             </w:r>
           </w:p>
         </w:tc>
@@ -6317,7 +6091,7 @@
                 <w:rFonts w:ascii="Times New Roman" w:hAnsi="Times New Roman" w:eastAsia="SimSun"/>
                 <w:sz w:val="15"/>
               </w:rPr>
-              <w:t>真实 MNIST 验证集上与官方库输出逐样本完全一致</w:t>
+              <w:t>在真实 MNIST 划分上与官方库输出逐样本完全比对</w:t>
             </w:r>
           </w:p>
         </w:tc>
@@ -6336,7 +6110,7 @@
                 <w:rFonts w:ascii="Times New Roman" w:hAnsi="Times New Roman" w:eastAsia="SimSun"/>
                 <w:sz w:val="15"/>
               </w:rPr>
-              <w:t>一致率 100%</w:t>
+              <w:t>一致率 100.00%</w:t>
             </w:r>
           </w:p>
         </w:tc>
@@ -6425,7 +6199,7 @@
           <w:color w:val="0F172A"/>
           <w:b/>
         </w:rPr>
-        <w:t>8.2 项目开源仓库与在线交互报告（供老师查阅）</w:t>
+        <w:t>8.2 作业工程复现说明</w:t>
       </w:r>
     </w:p>
     <w:p>
@@ -6440,119 +6214,39 @@
           <w:sz w:val="19"/>
           <w:szCs w:val="19"/>
         </w:rPr>
-        <w:t>本报告对应的全部源代码、100 组原始实验数据、高清矢量图表及自动化复现脚本已独立开源托管至全新 GitHub 仓库并部署为 GitHub Pages 静态网站，任课老师可直接点击链接或扫描右侧二维码在线审查源码与运行结果：</w:t>
-      </w:r>
-    </w:p>
-    <w:tbl>
-      <w:tblPr>
-        <w:tblW w:w="8300" w:type="dxa"/>
-        <w:tblBorders>
-          <w:top w:val="none"/>
-          <w:bottom w:val="none"/>
-          <w:left w:val="none"/>
-          <w:right w:val="none"/>
-          <w:insideH w:val="none"/>
-          <w:insideV w:val="none"/>
-        </w:tblBorders>
-      </w:tblPr>
-      <w:tr>
-        <w:tc>
-          <w:tcPr>
-            <w:tcW w:w="6100" w:type="dxa"/>
-          </w:tcPr>
-          <w:p>
-            <w:r>
-              <w:rPr>
-                <w:b/>
-              </w:rPr>
-              <w:t>• 在线静态报告与源码浏览：</w:t>
-            </w:r>
-          </w:p>
-          <w:p>
-            <w:r>
-              <w:rPr>
-                <w:color w:val="292524"/>
-              </w:rPr>
-              <w:t>https://lzcxvfs-maker.github.io/mnist-knn-analysis-2026/</w:t>
-            </w:r>
-          </w:p>
-          <w:p>
-            <w:r>
-              <w:rPr>
-                <w:b/>
-              </w:rPr>
-              <w:t>• GitHub 完整开源工程仓库：</w:t>
-            </w:r>
-          </w:p>
-          <w:p>
-            <w:r>
-              <w:rPr>
-                <w:color w:val="292524"/>
-              </w:rPr>
-              <w:t>https://github.com/lzcxvfs-maker/mnist-knn-analysis-2026</w:t>
-            </w:r>
-          </w:p>
-          <w:p>
-            <w:r>
-              <w:t>（支持一键运行复现：python run.py &amp;&amp; python handoff.py）</w:t>
-            </w:r>
-          </w:p>
-        </w:tc>
-        <w:tc>
-          <w:tcPr>
-            <w:tcW w:w="2200" w:type="dxa"/>
-          </w:tcPr>
-          <w:p>
-            <w:pPr>
-              <w:jc w:val="center"/>
-            </w:pPr>
-            <w:r>
-              <w:drawing>
-                <wp:inline distT="0" distB="0" distL="0" distR="0">
-                  <wp:extent cx="1143000" cy="1143000"/>
-                  <wp:docPr id="107" name="website_qr.png"/>
-                  <a:graphic>
-                    <a:graphicData uri="http://schemas.openxmlformats.org/drawingml/2006/picture">
-                      <pic:pic>
-                        <pic:nvPicPr>
-                          <pic:cNvPr id="0" name="website_qr.png"/>
-                          <pic:cNvPicPr/>
-                        </pic:nvPicPr>
-                        <pic:blipFill>
-                          <a:blip r:embed="rId12"/>
-                          <a:stretch>
-                            <a:fillRect/>
-                          </a:stretch>
-                        </pic:blipFill>
-                        <pic:spPr>
-                          <a:xfrm>
-                            <a:off x="0" y="0"/>
-                            <a:ext cx="1143000" cy="1143000"/>
-                          </a:xfrm>
-                          <a:prstGeom prst="rect">
-                            <a:avLst/>
-                          </a:prstGeom>
-                        </pic:spPr>
-                      </pic:pic>
-                    </a:graphicData>
-                  </a:graphic>
-                </wp:inline>
-              </w:drawing>
-            </w:r>
-          </w:p>
-          <w:p>
-            <w:pPr>
-              <w:jc w:val="center"/>
-            </w:pPr>
-            <w:r>
-              <w:rPr>
-                <w:sz w:val="13"/>
-              </w:rPr>
-            </w:r>
-          </w:p>
-        </w:tc>
-      </w:tr>
-    </w:tbl>
+        <w:t>为保证实验严谨与结论可查，全部源代码均包含独立单元测试与哈希指纹校验：</w:t>
+      </w:r>
+    </w:p>
+    <w:p>
+      <w:pPr>
+        <w:spacing w:after="40" w:line="240" w:lineRule="auto"/>
+        <w:jc w:val="left"/>
+        <w:ind w:firstLineChars="200" w:firstLine="420"/>
+      </w:pPr>
+      <w:r>
+        <w:rPr>
+          <w:rFonts w:ascii="Times New Roman" w:hAnsi="Times New Roman" w:eastAsia="SimSun"/>
+          <w:sz w:val="19"/>
+          <w:szCs w:val="19"/>
+        </w:rPr>
+        <w:t>• 环境要求：Python 3.11+ / PyTorch 2.2 / NumPy 1.26 / scikit-learn / scikit-image。</w:t>
+      </w:r>
+    </w:p>
+    <w:p>
+      <w:pPr>
+        <w:spacing w:after="40" w:line="240" w:lineRule="auto"/>
+        <w:jc w:val="left"/>
+        <w:ind w:firstLineChars="200" w:firstLine="420"/>
+      </w:pPr>
+      <w:r>
+        <w:rPr>
+          <w:rFonts w:ascii="Times New Roman" w:hAnsi="Times New Roman" w:eastAsia="SimSun"/>
+          <w:sz w:val="19"/>
+          <w:szCs w:val="19"/>
+        </w:rPr>
+        <w:t>• 一键复现：运行 python run.py 执行全流程，运行 python qa.py 执行 11 项算法 QA 单元测试。</w:t>
+      </w:r>
+    </w:p>
     <w:p>
       <w:pPr>
         <w:pageBreakBefore/>
@@ -6570,7 +6264,7 @@
           <w:color w:val="0F172A"/>
           <w:b/>
         </w:rPr>
-        <w:t>九、开源前端交互平台与核心设计特性展示</w:t>
+        <w:t>九、开源工程仓库与在线交互报告</w:t>
       </w:r>
     </w:p>
     <w:p>
@@ -6585,7 +6279,7 @@
           <w:sz w:val="19"/>
           <w:szCs w:val="19"/>
         </w:rPr>
-        <w:t>为便于任课老师直观审查全量实验数据、对比特征曲线与检视算法源码，本项目同步构建了严谨学术规范的前端在线交互系统。系统彻底摒弃冗余的修饰性图标，以纯净学术白（Academic Clean White）为基底，采用清晰衬线体核心数据指标与结构化双栏对比，全面呈现算法数学契约、两层确定性平票机制与工程加速效果。</w:t>
+        <w:t>为方便老师全方位审阅本次课程设计的完整实现、交互式检视 100 组超参数消融曲线并查验算法源代码，我已将全部源码、原始实验数据包及说明文档开源托管至 GitHub，并搭建了无依赖的 GitHub Pages 在线静态网站：</w:t>
       </w:r>
     </w:p>
     <w:p>
@@ -6602,7 +6296,7 @@
         <w:t/>
         <w:drawing>
           <wp:inline distT="0" distB="0" distL="0" distR="0">
-            <wp:extent cx="6096000" cy="3545485"/>
+            <wp:extent cx="5842000" cy="3397757"/>
             <wp:docPr id="108" name="editorial_report_showcase.png"/>
             <a:graphic>
               <a:graphicData uri="http://schemas.openxmlformats.org/drawingml/2006/picture">
@@ -6620,7 +6314,7 @@
                   <pic:spPr>
                     <a:xfrm>
                       <a:off x="0" y="0"/>
-                      <a:ext cx="6096000" cy="3545485"/>
+                      <a:ext cx="5842000" cy="3397757"/>
                     </a:xfrm>
                     <a:prstGeom prst="rect">
                       <a:avLst/>
@@ -6644,24 +6338,120 @@
           <w:sz w:val="17"/>
           <w:szCs w:val="17"/>
         </w:rPr>
-        <w:t>图 4：项目开源前端在线交互平台整体设计与核心技术特性概览（Academic Paper Design）</w:t>
-      </w:r>
-    </w:p>
-    <w:p>
-      <w:pPr>
-        <w:spacing w:after="40" w:line="240" w:lineRule="auto"/>
-        <w:jc w:val="left"/>
-        <w:ind w:firstLineChars="200" w:firstLine="420"/>
-      </w:pPr>
-      <w:r>
-        <w:rPr>
-          <w:rFonts w:ascii="Times New Roman" w:hAnsi="Times New Roman" w:eastAsia="SimSun"/>
-          <w:sz w:val="19"/>
-          <w:szCs w:val="19"/>
-        </w:rPr>
-        <w:t>在线平台支持 100 组超参数验证曲线即时缩放审查、SVD PCA 主成分方差分布交互、全量 10,000 张测试集经典蓝色混淆矩阵热力高亮，并内置 5 大核心代码模块（core.py、qa.py、run.py 等）的原生高亮阅读器，具备工业级端到端严谨交付规范。</w:t>
-      </w:r>
-    </w:p>
+        <w:t>图 5：开源前端在线交互报告系统整体架构与核心技术特性</w:t>
+      </w:r>
+    </w:p>
+    <w:tbl>
+      <w:tblPr>
+        <w:tblW w:w="8300" w:type="dxa"/>
+        <w:tblBorders>
+          <w:top w:val="none"/>
+          <w:bottom w:val="none"/>
+          <w:left w:val="none"/>
+          <w:right w:val="none"/>
+          <w:insideH w:val="none"/>
+          <w:insideV w:val="none"/>
+        </w:tblBorders>
+      </w:tblPr>
+      <w:tr>
+        <w:tc>
+          <w:tcPr>
+            <w:tcW w:w="6100" w:type="dxa"/>
+          </w:tcPr>
+          <w:p>
+            <w:r>
+              <w:rPr>
+                <w:b/>
+              </w:rPr>
+              <w:t>• 在线静态报告与源码浏览：</w:t>
+            </w:r>
+          </w:p>
+          <w:p>
+            <w:r>
+              <w:rPr>
+                <w:color w:val="1E3A8A"/>
+              </w:rPr>
+              <w:t>https://lzcxvfs-maker.github.io/mnist-knn-analysis-2026/</w:t>
+            </w:r>
+          </w:p>
+          <w:p>
+            <w:r>
+              <w:rPr>
+                <w:b/>
+              </w:rPr>
+              <w:t>• GitHub 完整开源工程仓库：</w:t>
+            </w:r>
+          </w:p>
+          <w:p>
+            <w:r>
+              <w:rPr>
+                <w:color w:val="1E3A8A"/>
+              </w:rPr>
+              <w:t>https://github.com/lzcxvfs-maker/mnist-knn-analysis-2026</w:t>
+            </w:r>
+          </w:p>
+          <w:p>
+            <w:r>
+              <w:t>（在线网站支持即时交互审查；老师亦可随时在本地一键运行复现）</w:t>
+            </w:r>
+          </w:p>
+        </w:tc>
+        <w:tc>
+          <w:tcPr>
+            <w:tcW w:w="2200" w:type="dxa"/>
+          </w:tcPr>
+          <w:p>
+            <w:pPr>
+              <w:jc w:val="center"/>
+            </w:pPr>
+            <w:r>
+              <w:drawing>
+                <wp:inline distT="0" distB="0" distL="0" distR="0">
+                  <wp:extent cx="1079500" cy="1079500"/>
+                  <wp:docPr id="109" name="website_qr.png"/>
+                  <a:graphic>
+                    <a:graphicData uri="http://schemas.openxmlformats.org/drawingml/2006/picture">
+                      <pic:pic>
+                        <pic:nvPicPr>
+                          <pic:cNvPr id="0" name="website_qr.png"/>
+                          <pic:cNvPicPr/>
+                        </pic:nvPicPr>
+                        <pic:blipFill>
+                          <a:blip r:embed="rId14"/>
+                          <a:stretch>
+                            <a:fillRect/>
+                          </a:stretch>
+                        </pic:blipFill>
+                        <pic:spPr>
+                          <a:xfrm>
+                            <a:off x="0" y="0"/>
+                            <a:ext cx="1079500" cy="1079500"/>
+                          </a:xfrm>
+                          <a:prstGeom prst="rect">
+                            <a:avLst/>
+                          </a:prstGeom>
+                        </pic:spPr>
+                      </pic:pic>
+                    </a:graphicData>
+                  </a:graphic>
+                </wp:inline>
+              </w:drawing>
+            </w:r>
+          </w:p>
+          <w:p>
+            <w:pPr>
+              <w:jc w:val="center"/>
+            </w:pPr>
+            <w:r>
+              <w:rPr>
+                <w:sz w:val="13"/>
+              </w:rPr>
+              <w:t>手机扫码直接浏览</w:t>
+            </w:r>
+          </w:p>
+        </w:tc>
+      </w:tr>
+    </w:tbl>
     <w:sectPr>
       <w:pgSz w:w="11906" w:h="16838"/>
       <w:pgMar w:top="1440" w:right="1800" w:bottom="1440" w:left="1800" w:header="851" w:footer="992" w:gutter="0"/>

</xml_diff>

<commit_message>
Update MNIST_kNN_设计报告_最终提交版.docx with dedicated TOC page and enriched layout
</commit_message>
<xml_diff>
--- a/MNIST_kNN_设计报告_最终提交版.docx
+++ b/MNIST_kNN_设计报告_最终提交版.docx
@@ -1166,6 +1166,697 @@
     <w:p/>
     <w:p>
       <w:pPr>
+        <w:spacing w:after="160" w:line="240" w:lineRule="auto"/>
+        <w:jc w:val="center"/>
+      </w:pPr>
+      <w:r>
+        <w:rPr>
+          <w:rFonts w:ascii="黑体" w:hAnsi="黑体" w:eastAsia="黑体"/>
+          <w:b/>
+          <w:color w:val="0F172A"/>
+          <w:sz w:val="32"/>
+          <w:szCs w:val="32"/>
+        </w:rPr>
+        <w:t>目    录</w:t>
+      </w:r>
+    </w:p>
+    <w:p>
+      <w:pPr>
+        <w:tabs>
+          <w:tab w:val="right" w:leader="dot" w:pos="8300"/>
+        </w:tabs>
+        <w:spacing w:before="40" w:after="50" w:line="230" w:lineRule="auto"/>
+      </w:pPr>
+      <w:r>
+        <w:rPr>
+          <w:rFonts w:ascii="黑体" w:hAnsi="黑体" w:eastAsia="黑体"/>
+          <w:b/>
+          <w:color w:val="0F172A"/>
+          <w:sz w:val="20"/>
+        </w:rPr>
+        <w:t>一、摘要与核心算法数学契约</w:t>
+      </w:r>
+      <w:r>
+        <w:tab/>
+      </w:r>
+      <w:r>
+        <w:rPr>
+          <w:rFonts w:ascii="Times New Roman" w:hAnsi="Times New Roman" w:eastAsia="Times New Roman"/>
+          <w:b/>
+          <w:sz w:val="20"/>
+        </w:rPr>
+        <w:t>3</w:t>
+      </w:r>
+    </w:p>
+    <w:p>
+      <w:pPr>
+        <w:tabs>
+          <w:tab w:val="right" w:leader="dot" w:pos="8300"/>
+        </w:tabs>
+        <w:spacing w:before="0" w:after="30" w:line="230" w:lineRule="auto"/>
+      </w:pPr>
+      <w:r>
+        <w:rPr>
+          <w:rFonts w:ascii="Times New Roman" w:hAnsi="Times New Roman" w:eastAsia="宋体"/>
+          <w:sz w:val="18"/>
+        </w:rPr>
+        <w:t>1.1 核心算法设计与数学契约</w:t>
+      </w:r>
+      <w:r>
+        <w:tab/>
+      </w:r>
+      <w:r>
+        <w:rPr>
+          <w:rFonts w:ascii="Times New Roman" w:hAnsi="Times New Roman" w:eastAsia="Times New Roman"/>
+          <w:sz w:val="18"/>
+        </w:rPr>
+        <w:t>3</w:t>
+      </w:r>
+    </w:p>
+    <w:p>
+      <w:pPr>
+        <w:tabs>
+          <w:tab w:val="right" w:leader="dot" w:pos="8300"/>
+        </w:tabs>
+        <w:spacing w:before="40" w:after="50" w:line="230" w:lineRule="auto"/>
+      </w:pPr>
+      <w:r>
+        <w:rPr>
+          <w:rFonts w:ascii="黑体" w:hAnsi="黑体" w:eastAsia="黑体"/>
+          <w:b/>
+          <w:color w:val="0F172A"/>
+          <w:sz w:val="20"/>
+        </w:rPr>
+        <w:t>二、数据集划分、实验环境与评价体系</w:t>
+      </w:r>
+      <w:r>
+        <w:tab/>
+      </w:r>
+      <w:r>
+        <w:rPr>
+          <w:rFonts w:ascii="Times New Roman" w:hAnsi="Times New Roman" w:eastAsia="Times New Roman"/>
+          <w:b/>
+          <w:sz w:val="20"/>
+        </w:rPr>
+        <w:t>4</w:t>
+      </w:r>
+    </w:p>
+    <w:p>
+      <w:pPr>
+        <w:tabs>
+          <w:tab w:val="right" w:leader="dot" w:pos="8300"/>
+        </w:tabs>
+        <w:spacing w:before="0" w:after="30" w:line="230" w:lineRule="auto"/>
+      </w:pPr>
+      <w:r>
+        <w:rPr>
+          <w:rFonts w:ascii="Times New Roman" w:hAnsi="Times New Roman" w:eastAsia="宋体"/>
+          <w:sz w:val="18"/>
+        </w:rPr>
+        <w:t>2.1 严谨的三阶段子集划分（避免数据泄漏）</w:t>
+      </w:r>
+      <w:r>
+        <w:tab/>
+      </w:r>
+      <w:r>
+        <w:rPr>
+          <w:rFonts w:ascii="Times New Roman" w:hAnsi="Times New Roman" w:eastAsia="Times New Roman"/>
+          <w:sz w:val="18"/>
+        </w:rPr>
+        <w:t>4</w:t>
+      </w:r>
+    </w:p>
+    <w:p>
+      <w:pPr>
+        <w:tabs>
+          <w:tab w:val="right" w:leader="dot" w:pos="8300"/>
+        </w:tabs>
+        <w:spacing w:before="0" w:after="30" w:line="230" w:lineRule="auto"/>
+      </w:pPr>
+      <w:r>
+        <w:rPr>
+          <w:rFonts w:ascii="Times New Roman" w:hAnsi="Times New Roman" w:eastAsia="宋体"/>
+          <w:sz w:val="18"/>
+        </w:rPr>
+        <w:t>2.2 软硬件运行环境与依赖</w:t>
+      </w:r>
+      <w:r>
+        <w:tab/>
+      </w:r>
+      <w:r>
+        <w:rPr>
+          <w:rFonts w:ascii="Times New Roman" w:hAnsi="Times New Roman" w:eastAsia="Times New Roman"/>
+          <w:sz w:val="18"/>
+        </w:rPr>
+        <w:t>4</w:t>
+      </w:r>
+    </w:p>
+    <w:p>
+      <w:pPr>
+        <w:tabs>
+          <w:tab w:val="right" w:leader="dot" w:pos="8300"/>
+        </w:tabs>
+        <w:spacing w:before="0" w:after="30" w:line="230" w:lineRule="auto"/>
+      </w:pPr>
+      <w:r>
+        <w:rPr>
+          <w:rFonts w:ascii="Times New Roman" w:hAnsi="Times New Roman" w:eastAsia="宋体"/>
+          <w:sz w:val="18"/>
+        </w:rPr>
+        <w:t>2.3 多维客观评价指标体系</w:t>
+      </w:r>
+      <w:r>
+        <w:tab/>
+      </w:r>
+      <w:r>
+        <w:rPr>
+          <w:rFonts w:ascii="Times New Roman" w:hAnsi="Times New Roman" w:eastAsia="Times New Roman"/>
+          <w:sz w:val="18"/>
+        </w:rPr>
+        <w:t>4</w:t>
+      </w:r>
+    </w:p>
+    <w:p>
+      <w:pPr>
+        <w:tabs>
+          <w:tab w:val="right" w:leader="dot" w:pos="8300"/>
+        </w:tabs>
+        <w:spacing w:before="40" w:after="50" w:line="230" w:lineRule="auto"/>
+      </w:pPr>
+      <w:r>
+        <w:rPr>
+          <w:rFonts w:ascii="黑体" w:hAnsi="黑体" w:eastAsia="黑体"/>
+          <w:b/>
+          <w:color w:val="0F172A"/>
+          <w:sz w:val="20"/>
+        </w:rPr>
+        <w:t>三、分批向量化 kNN 实现与微基准效率分析</w:t>
+      </w:r>
+      <w:r>
+        <w:tab/>
+      </w:r>
+      <w:r>
+        <w:rPr>
+          <w:rFonts w:ascii="Times New Roman" w:hAnsi="Times New Roman" w:eastAsia="Times New Roman"/>
+          <w:b/>
+          <w:sz w:val="20"/>
+        </w:rPr>
+        <w:t>5</w:t>
+      </w:r>
+    </w:p>
+    <w:p>
+      <w:pPr>
+        <w:tabs>
+          <w:tab w:val="right" w:leader="dot" w:pos="8300"/>
+        </w:tabs>
+        <w:spacing w:before="0" w:after="30" w:line="230" w:lineRule="auto"/>
+      </w:pPr>
+      <w:r>
+        <w:rPr>
+          <w:rFonts w:ascii="Times New Roman" w:hAnsi="Times New Roman" w:eastAsia="宋体"/>
+          <w:sz w:val="18"/>
+        </w:rPr>
+        <w:t>3.1 核心算法实现摘录（core.py）</w:t>
+      </w:r>
+      <w:r>
+        <w:tab/>
+      </w:r>
+      <w:r>
+        <w:rPr>
+          <w:rFonts w:ascii="Times New Roman" w:hAnsi="Times New Roman" w:eastAsia="Times New Roman"/>
+          <w:sz w:val="18"/>
+        </w:rPr>
+        <w:t>5</w:t>
+      </w:r>
+    </w:p>
+    <w:p>
+      <w:pPr>
+        <w:tabs>
+          <w:tab w:val="right" w:leader="dot" w:pos="8300"/>
+        </w:tabs>
+        <w:spacing w:before="0" w:after="30" w:line="230" w:lineRule="auto"/>
+      </w:pPr>
+      <w:r>
+        <w:rPr>
+          <w:rFonts w:ascii="Times New Roman" w:hAnsi="Times New Roman" w:eastAsia="宋体"/>
+          <w:sz w:val="18"/>
+        </w:rPr>
+        <w:t>3.2 距离计算微基准对比与加速分析</w:t>
+      </w:r>
+      <w:r>
+        <w:tab/>
+      </w:r>
+      <w:r>
+        <w:rPr>
+          <w:rFonts w:ascii="Times New Roman" w:hAnsi="Times New Roman" w:eastAsia="Times New Roman"/>
+          <w:sz w:val="18"/>
+        </w:rPr>
+        <w:t>5</w:t>
+      </w:r>
+    </w:p>
+    <w:p>
+      <w:pPr>
+        <w:tabs>
+          <w:tab w:val="right" w:leader="dot" w:pos="8300"/>
+        </w:tabs>
+        <w:spacing w:before="0" w:after="30" w:line="230" w:lineRule="auto"/>
+      </w:pPr>
+      <w:r>
+        <w:rPr>
+          <w:rFonts w:ascii="Times New Roman" w:hAnsi="Times New Roman" w:eastAsia="宋体"/>
+          <w:sz w:val="18"/>
+        </w:rPr>
+        <w:t>3.3 与 scikit-learn 交叉验证对照</w:t>
+      </w:r>
+      <w:r>
+        <w:tab/>
+      </w:r>
+      <w:r>
+        <w:rPr>
+          <w:rFonts w:ascii="Times New Roman" w:hAnsi="Times New Roman" w:eastAsia="Times New Roman"/>
+          <w:sz w:val="18"/>
+        </w:rPr>
+        <w:t>5</w:t>
+      </w:r>
+    </w:p>
+    <w:p>
+      <w:pPr>
+        <w:tabs>
+          <w:tab w:val="right" w:leader="dot" w:pos="8300"/>
+        </w:tabs>
+        <w:spacing w:before="40" w:after="50" w:line="230" w:lineRule="auto"/>
+      </w:pPr>
+      <w:r>
+        <w:rPr>
+          <w:rFonts w:ascii="黑体" w:hAnsi="黑体" w:eastAsia="黑体"/>
+          <w:b/>
+          <w:color w:val="0F172A"/>
+          <w:sz w:val="20"/>
+        </w:rPr>
+        <w:t>四、100 组网格搜索：超参数 k 与特征表现规律</w:t>
+      </w:r>
+      <w:r>
+        <w:tab/>
+      </w:r>
+      <w:r>
+        <w:rPr>
+          <w:rFonts w:ascii="Times New Roman" w:hAnsi="Times New Roman" w:eastAsia="Times New Roman"/>
+          <w:b/>
+          <w:sz w:val="20"/>
+        </w:rPr>
+        <w:t>6</w:t>
+      </w:r>
+    </w:p>
+    <w:p>
+      <w:pPr>
+        <w:tabs>
+          <w:tab w:val="right" w:leader="dot" w:pos="8300"/>
+        </w:tabs>
+        <w:spacing w:before="0" w:after="30" w:line="230" w:lineRule="auto"/>
+      </w:pPr>
+      <w:r>
+        <w:rPr>
+          <w:rFonts w:ascii="Times New Roman" w:hAnsi="Times New Roman" w:eastAsia="宋体"/>
+          <w:sz w:val="18"/>
+        </w:rPr>
+        <w:t>4.1 典型配置验证准确率对比</w:t>
+      </w:r>
+      <w:r>
+        <w:tab/>
+      </w:r>
+      <w:r>
+        <w:rPr>
+          <w:rFonts w:ascii="Times New Roman" w:hAnsi="Times New Roman" w:eastAsia="Times New Roman"/>
+          <w:sz w:val="18"/>
+        </w:rPr>
+        <w:t>6</w:t>
+      </w:r>
+    </w:p>
+    <w:p>
+      <w:pPr>
+        <w:tabs>
+          <w:tab w:val="right" w:leader="dot" w:pos="8300"/>
+        </w:tabs>
+        <w:spacing w:before="0" w:after="30" w:line="230" w:lineRule="auto"/>
+      </w:pPr>
+      <w:r>
+        <w:rPr>
+          <w:rFonts w:ascii="Times New Roman" w:hAnsi="Times New Roman" w:eastAsia="宋体"/>
+          <w:sz w:val="18"/>
+        </w:rPr>
+        <w:t>4.2 超参数敏感度与消融分析</w:t>
+      </w:r>
+      <w:r>
+        <w:tab/>
+      </w:r>
+      <w:r>
+        <w:rPr>
+          <w:rFonts w:ascii="Times New Roman" w:hAnsi="Times New Roman" w:eastAsia="Times New Roman"/>
+          <w:sz w:val="18"/>
+        </w:rPr>
+        <w:t>6</w:t>
+      </w:r>
+    </w:p>
+    <w:p>
+      <w:pPr>
+        <w:tabs>
+          <w:tab w:val="right" w:leader="dot" w:pos="8300"/>
+        </w:tabs>
+        <w:spacing w:before="40" w:after="50" w:line="230" w:lineRule="auto"/>
+      </w:pPr>
+      <w:r>
+        <w:rPr>
+          <w:rFonts w:ascii="黑体" w:hAnsi="黑体" w:eastAsia="黑体"/>
+          <w:b/>
+          <w:color w:val="0F172A"/>
+          <w:sz w:val="20"/>
+        </w:rPr>
+        <w:t>五、图像特征探索：SVD PCA 降维与局部梯度 HOG</w:t>
+      </w:r>
+      <w:r>
+        <w:tab/>
+      </w:r>
+      <w:r>
+        <w:rPr>
+          <w:rFonts w:ascii="Times New Roman" w:hAnsi="Times New Roman" w:eastAsia="Times New Roman"/>
+          <w:b/>
+          <w:sz w:val="20"/>
+        </w:rPr>
+        <w:t>7</w:t>
+      </w:r>
+    </w:p>
+    <w:p>
+      <w:pPr>
+        <w:tabs>
+          <w:tab w:val="right" w:leader="dot" w:pos="8300"/>
+        </w:tabs>
+        <w:spacing w:before="0" w:after="30" w:line="230" w:lineRule="auto"/>
+      </w:pPr>
+      <w:r>
+        <w:rPr>
+          <w:rFonts w:ascii="Times New Roman" w:hAnsi="Times New Roman" w:eastAsia="宋体"/>
+          <w:sz w:val="18"/>
+        </w:rPr>
+        <w:t>5.1 五种特征提取方案验证表现对比</w:t>
+      </w:r>
+      <w:r>
+        <w:tab/>
+      </w:r>
+      <w:r>
+        <w:rPr>
+          <w:rFonts w:ascii="Times New Roman" w:hAnsi="Times New Roman" w:eastAsia="Times New Roman"/>
+          <w:sz w:val="18"/>
+        </w:rPr>
+        <w:t>7</w:t>
+      </w:r>
+    </w:p>
+    <w:p>
+      <w:pPr>
+        <w:tabs>
+          <w:tab w:val="right" w:leader="dot" w:pos="8300"/>
+        </w:tabs>
+        <w:spacing w:before="0" w:after="30" w:line="230" w:lineRule="auto"/>
+      </w:pPr>
+      <w:r>
+        <w:rPr>
+          <w:rFonts w:ascii="Times New Roman" w:hAnsi="Times New Roman" w:eastAsia="宋体"/>
+          <w:sz w:val="18"/>
+        </w:rPr>
+        <w:t>5.2 特征表征能力与计算复杂度权衡</w:t>
+      </w:r>
+      <w:r>
+        <w:tab/>
+      </w:r>
+      <w:r>
+        <w:rPr>
+          <w:rFonts w:ascii="Times New Roman" w:hAnsi="Times New Roman" w:eastAsia="Times New Roman"/>
+          <w:sz w:val="18"/>
+        </w:rPr>
+        <w:t>7</w:t>
+      </w:r>
+    </w:p>
+    <w:p>
+      <w:pPr>
+        <w:tabs>
+          <w:tab w:val="right" w:leader="dot" w:pos="8300"/>
+        </w:tabs>
+        <w:spacing w:before="40" w:after="50" w:line="230" w:lineRule="auto"/>
+      </w:pPr>
+      <w:r>
+        <w:rPr>
+          <w:rFonts w:ascii="黑体" w:hAnsi="黑体" w:eastAsia="黑体"/>
+          <w:b/>
+          <w:color w:val="0F172A"/>
+          <w:sz w:val="20"/>
+        </w:rPr>
+        <w:t>六、完整测试集评估（10,000 张）与逐类性能诊断</w:t>
+      </w:r>
+      <w:r>
+        <w:tab/>
+      </w:r>
+      <w:r>
+        <w:rPr>
+          <w:rFonts w:ascii="Times New Roman" w:hAnsi="Times New Roman" w:eastAsia="Times New Roman"/>
+          <w:b/>
+          <w:sz w:val="20"/>
+        </w:rPr>
+        <w:t>8</w:t>
+      </w:r>
+    </w:p>
+    <w:p>
+      <w:pPr>
+        <w:tabs>
+          <w:tab w:val="right" w:leader="dot" w:pos="8300"/>
+        </w:tabs>
+        <w:spacing w:before="0" w:after="30" w:line="230" w:lineRule="auto"/>
+      </w:pPr>
+      <w:r>
+        <w:rPr>
+          <w:rFonts w:ascii="Times New Roman" w:hAnsi="Times New Roman" w:eastAsia="宋体"/>
+          <w:sz w:val="18"/>
+        </w:rPr>
+        <w:t>6.1 最终测试综合指标汇总</w:t>
+      </w:r>
+      <w:r>
+        <w:tab/>
+      </w:r>
+      <w:r>
+        <w:rPr>
+          <w:rFonts w:ascii="Times New Roman" w:hAnsi="Times New Roman" w:eastAsia="Times New Roman"/>
+          <w:sz w:val="18"/>
+        </w:rPr>
+        <w:t>8</w:t>
+      </w:r>
+    </w:p>
+    <w:p>
+      <w:pPr>
+        <w:tabs>
+          <w:tab w:val="right" w:leader="dot" w:pos="8300"/>
+        </w:tabs>
+        <w:spacing w:before="0" w:after="30" w:line="230" w:lineRule="auto"/>
+      </w:pPr>
+      <w:r>
+        <w:rPr>
+          <w:rFonts w:ascii="Times New Roman" w:hAnsi="Times New Roman" w:eastAsia="宋体"/>
+          <w:sz w:val="18"/>
+        </w:rPr>
+        <w:t>6.2 逐类别详细分类报告 (Precision / Recall / F1)</w:t>
+      </w:r>
+      <w:r>
+        <w:tab/>
+      </w:r>
+      <w:r>
+        <w:rPr>
+          <w:rFonts w:ascii="Times New Roman" w:hAnsi="Times New Roman" w:eastAsia="Times New Roman"/>
+          <w:sz w:val="18"/>
+        </w:rPr>
+        <w:t>8</w:t>
+      </w:r>
+    </w:p>
+    <w:p>
+      <w:pPr>
+        <w:tabs>
+          <w:tab w:val="right" w:leader="dot" w:pos="8300"/>
+        </w:tabs>
+        <w:spacing w:before="40" w:after="50" w:line="230" w:lineRule="auto"/>
+      </w:pPr>
+      <w:r>
+        <w:rPr>
+          <w:rFonts w:ascii="黑体" w:hAnsi="黑体" w:eastAsia="黑体"/>
+          <w:b/>
+          <w:color w:val="0F172A"/>
+          <w:sz w:val="20"/>
+        </w:rPr>
+        <w:t>七、混淆矩阵深入诊断与误分类案例归因</w:t>
+      </w:r>
+      <w:r>
+        <w:tab/>
+      </w:r>
+      <w:r>
+        <w:rPr>
+          <w:rFonts w:ascii="Times New Roman" w:hAnsi="Times New Roman" w:eastAsia="Times New Roman"/>
+          <w:b/>
+          <w:sz w:val="20"/>
+        </w:rPr>
+        <w:t>9</w:t>
+      </w:r>
+    </w:p>
+    <w:p>
+      <w:pPr>
+        <w:tabs>
+          <w:tab w:val="right" w:leader="dot" w:pos="8300"/>
+        </w:tabs>
+        <w:spacing w:before="0" w:after="30" w:line="230" w:lineRule="auto"/>
+      </w:pPr>
+      <w:r>
+        <w:rPr>
+          <w:rFonts w:ascii="Times New Roman" w:hAnsi="Times New Roman" w:eastAsia="宋体"/>
+          <w:sz w:val="18"/>
+        </w:rPr>
+        <w:t>7.1 典型误分类样本与训练集近邻对比原图</w:t>
+      </w:r>
+      <w:r>
+        <w:tab/>
+      </w:r>
+      <w:r>
+        <w:rPr>
+          <w:rFonts w:ascii="Times New Roman" w:hAnsi="Times New Roman" w:eastAsia="Times New Roman"/>
+          <w:sz w:val="18"/>
+        </w:rPr>
+        <w:t>9</w:t>
+      </w:r>
+    </w:p>
+    <w:p>
+      <w:pPr>
+        <w:tabs>
+          <w:tab w:val="right" w:leader="dot" w:pos="8300"/>
+        </w:tabs>
+        <w:spacing w:before="0" w:after="30" w:line="230" w:lineRule="auto"/>
+      </w:pPr>
+      <w:r>
+        <w:rPr>
+          <w:rFonts w:ascii="Times New Roman" w:hAnsi="Times New Roman" w:eastAsia="宋体"/>
+          <w:sz w:val="18"/>
+        </w:rPr>
+        <w:t>7.2 高频有向混淆形态学成因与算法局限性探讨</w:t>
+      </w:r>
+      <w:r>
+        <w:tab/>
+      </w:r>
+      <w:r>
+        <w:rPr>
+          <w:rFonts w:ascii="Times New Roman" w:hAnsi="Times New Roman" w:eastAsia="Times New Roman"/>
+          <w:sz w:val="18"/>
+        </w:rPr>
+        <w:t>9</w:t>
+      </w:r>
+    </w:p>
+    <w:p>
+      <w:pPr>
+        <w:tabs>
+          <w:tab w:val="right" w:leader="dot" w:pos="8300"/>
+        </w:tabs>
+        <w:spacing w:before="40" w:after="50" w:line="230" w:lineRule="auto"/>
+      </w:pPr>
+      <w:r>
+        <w:rPr>
+          <w:rFonts w:ascii="黑体" w:hAnsi="黑体" w:eastAsia="黑体"/>
+          <w:b/>
+          <w:color w:val="0F172A"/>
+          <w:sz w:val="20"/>
+        </w:rPr>
+        <w:t>八、总结讨论、QA 验证、工程复现与开源系统</w:t>
+      </w:r>
+      <w:r>
+        <w:tab/>
+      </w:r>
+      <w:r>
+        <w:rPr>
+          <w:rFonts w:ascii="Times New Roman" w:hAnsi="Times New Roman" w:eastAsia="Times New Roman"/>
+          <w:b/>
+          <w:sz w:val="20"/>
+        </w:rPr>
+        <w:t>10</w:t>
+      </w:r>
+    </w:p>
+    <w:p>
+      <w:pPr>
+        <w:tabs>
+          <w:tab w:val="right" w:leader="dot" w:pos="8300"/>
+        </w:tabs>
+        <w:spacing w:before="0" w:after="30" w:line="230" w:lineRule="auto"/>
+      </w:pPr>
+      <w:r>
+        <w:rPr>
+          <w:rFonts w:ascii="Times New Roman" w:hAnsi="Times New Roman" w:eastAsia="宋体"/>
+          <w:sz w:val="18"/>
+        </w:rPr>
+        <w:t>8.1 算法单元测试与科学性验证</w:t>
+      </w:r>
+      <w:r>
+        <w:tab/>
+      </w:r>
+      <w:r>
+        <w:rPr>
+          <w:rFonts w:ascii="Times New Roman" w:hAnsi="Times New Roman" w:eastAsia="Times New Roman"/>
+          <w:sz w:val="18"/>
+        </w:rPr>
+        <w:t>10</w:t>
+      </w:r>
+    </w:p>
+    <w:p>
+      <w:pPr>
+        <w:tabs>
+          <w:tab w:val="right" w:leader="dot" w:pos="8300"/>
+        </w:tabs>
+        <w:spacing w:before="0" w:after="30" w:line="230" w:lineRule="auto"/>
+      </w:pPr>
+      <w:r>
+        <w:rPr>
+          <w:rFonts w:ascii="Times New Roman" w:hAnsi="Times New Roman" w:eastAsia="宋体"/>
+          <w:sz w:val="18"/>
+        </w:rPr>
+        <w:t>8.2 作业工程复现指南</w:t>
+      </w:r>
+      <w:r>
+        <w:tab/>
+      </w:r>
+      <w:r>
+        <w:rPr>
+          <w:rFonts w:ascii="Times New Roman" w:hAnsi="Times New Roman" w:eastAsia="Times New Roman"/>
+          <w:sz w:val="18"/>
+        </w:rPr>
+        <w:t>10</w:t>
+      </w:r>
+    </w:p>
+    <w:p>
+      <w:pPr>
+        <w:tabs>
+          <w:tab w:val="right" w:leader="dot" w:pos="8300"/>
+        </w:tabs>
+        <w:spacing w:before="0" w:after="30" w:line="230" w:lineRule="auto"/>
+      </w:pPr>
+      <w:r>
+        <w:rPr>
+          <w:rFonts w:ascii="Times New Roman" w:hAnsi="Times New Roman" w:eastAsia="宋体"/>
+          <w:sz w:val="18"/>
+        </w:rPr>
+        <w:t>8.3 开源工程仓库与在线交互报告系统</w:t>
+      </w:r>
+      <w:r>
+        <w:tab/>
+      </w:r>
+      <w:r>
+        <w:rPr>
+          <w:rFonts w:ascii="Times New Roman" w:hAnsi="Times New Roman" w:eastAsia="Times New Roman"/>
+          <w:sz w:val="18"/>
+        </w:rPr>
+        <w:t>10</w:t>
+      </w:r>
+    </w:p>
+    <w:p>
+      <w:pPr>
+        <w:pageBreakBefore/>
         <w:pBdr>
           <w:bottom w:val="single" w:color="1E3A8A" w:sz="12" w:space="4"/>
         </w:pBdr>
@@ -1180,7 +1871,7 @@
           <w:sz w:val="28"/>
           <w:szCs w:val="28"/>
         </w:rPr>
-        <w:t>一、摘要、章节目录与方法原则</w:t>
+        <w:t>一、摘要与核心算法数学契约</w:t>
       </w:r>
     </w:p>
     <w:p>
@@ -1195,7 +1886,22 @@
           <w:sz w:val="19"/>
           <w:szCs w:val="19"/>
         </w:rPr>
-        <w:t>本报告基于经典非参数模式识别算法——k近邻（k-Nearest Neighbors, kNN），针对 MNIST 手写体数字图像分类任务展开全面系统的工程实现与评估。传统 kNN 训练零开销但推理计算量巨大，本项目完整实现了中心化 SVD PCA 降维、HOG 局部特征提取及分批向量化距离检索算法。实验遵循三阶段无泄漏划分原则：从 60,000 张训练集中抽取 12,000 张训练子集与 2,000 张独立验证子集进行 100 组超参数网格搜索；锁定最优配置后，使用全部 60,000 张训练样本拟合并在独立的 10,000 张全量测试集上进行最终评测。</w:t>
+        <w:t>本报告基于经典非参数模式识别算法——k近邻（k-Nearest Neighbors, kNN），针对 MNIST 手写体数字图像分类任务展开全面系统的工程实现与评估。传统 kNN 训练零开销但推理计算量巨大，本项目完整实现了中心化 SVD PCA 降维、HOG 局部特征提取及分批向量化距离检索算法。</w:t>
+      </w:r>
+    </w:p>
+    <w:p>
+      <w:pPr>
+        <w:spacing w:after="40" w:line="240" w:lineRule="auto"/>
+        <w:ind w:firstLine="380" w:firstLineChars="200"/>
+        <w:jc w:val="left"/>
+      </w:pPr>
+      <w:r>
+        <w:rPr>
+          <w:rFonts w:ascii="Times New Roman" w:hAnsi="Times New Roman" w:eastAsia="宋体"/>
+          <w:sz w:val="19"/>
+          <w:szCs w:val="19"/>
+        </w:rPr>
+        <w:t>实验遵循三阶段无泄漏划分原则：从 60,000 张训练集中抽取 12,000 张训练子集与 2,000 张独立验证子集进行 100 组超参数网格搜索；锁定最优配置后，使用全部 60,000 张训练样本拟合并在独立的 10,000 张全量测试集上进行最终评测。</w:t>
       </w:r>
     </w:p>
     <w:p>
@@ -1211,617 +1917,7 @@
           <w:sz w:val="21"/>
           <w:szCs w:val="21"/>
         </w:rPr>
-        <w:t>1.1 报告章节导航与目录索引 (Table of Contents)</w:t>
-      </w:r>
-    </w:p>
-    <w:tbl>
-      <w:tblPr>
-        <w:tblStyle w:val="4"/>
-        <w:tblW w:w="8300" w:type="dxa"/>
-        <w:tblInd w:w="0" w:type="dxa"/>
-        <w:tblBorders>
-          <w:top w:val="single" w:color="1E293B" w:sz="8" w:space="0"/>
-          <w:left w:val="none" w:color="auto" w:sz="0" w:space="0"/>
-          <w:bottom w:val="single" w:color="1E293B" w:sz="8" w:space="0"/>
-          <w:right w:val="none" w:color="auto" w:sz="0" w:space="0"/>
-          <w:insideH w:val="single" w:color="E2E8F0" w:sz="4" w:space="0"/>
-          <w:insideV w:val="none" w:color="auto" w:sz="0" w:space="0"/>
-        </w:tblBorders>
-        <w:tblLayout w:type="fixed"/>
-        <w:tblCellMar>
-          <w:top w:w="50" w:type="dxa"/>
-          <w:left w:w="50" w:type="dxa"/>
-          <w:bottom w:w="50" w:type="dxa"/>
-          <w:right w:w="50" w:type="dxa"/>
-        </w:tblCellMar>
-      </w:tblPr>
-      <w:tblGrid>
-        <w:gridCol w:w="2800"/>
-        <w:gridCol w:w="1350"/>
-        <w:gridCol w:w="2800"/>
-        <w:gridCol w:w="1350"/>
-      </w:tblGrid>
-      <w:tr>
-        <w:tblPrEx>
-          <w:tblBorders>
-            <w:top w:val="single" w:color="1E293B" w:sz="8" w:space="0"/>
-            <w:left w:val="none" w:color="auto" w:sz="0" w:space="0"/>
-            <w:bottom w:val="single" w:color="1E293B" w:sz="8" w:space="0"/>
-            <w:right w:val="none" w:color="auto" w:sz="0" w:space="0"/>
-            <w:insideH w:val="single" w:color="E2E8F0" w:sz="4" w:space="0"/>
-            <w:insideV w:val="none" w:color="auto" w:sz="0" w:space="0"/>
-          </w:tblBorders>
-          <w:tblCellMar>
-            <w:top w:w="50" w:type="dxa"/>
-            <w:left w:w="50" w:type="dxa"/>
-            <w:bottom w:w="50" w:type="dxa"/>
-            <w:right w:w="50" w:type="dxa"/>
-          </w:tblCellMar>
-        </w:tblPrEx>
-        <w:tc>
-          <w:tcPr>
-            <w:tcW w:w="2800" w:type="dxa"/>
-            <w:shd w:val="clear" w:color="auto" w:fill="1E3A8A"/>
-          </w:tcPr>
-          <w:p>
-            <w:pPr>
-              <w:spacing w:before="0" w:after="0" w:line="200" w:lineRule="auto"/>
-              <w:jc w:val="left"/>
-            </w:pPr>
-            <w:r>
-              <w:rPr>
-                <w:rFonts w:ascii="黑体" w:hAnsi="黑体" w:eastAsia="黑体"/>
-                <w:b/>
-                <w:color w:val="FFFFFF"/>
-                <w:sz w:val="15"/>
-              </w:rPr>
-              <w:t>章节编号与主题</w:t>
-            </w:r>
-          </w:p>
-        </w:tc>
-        <w:tc>
-          <w:tcPr>
-            <w:tcW w:w="1350" w:type="dxa"/>
-            <w:shd w:val="clear" w:color="auto" w:fill="1E3A8A"/>
-          </w:tcPr>
-          <w:p>
-            <w:pPr>
-              <w:spacing w:before="0" w:after="0" w:line="200" w:lineRule="auto"/>
-              <w:jc w:val="center"/>
-            </w:pPr>
-            <w:r>
-              <w:rPr>
-                <w:rFonts w:ascii="黑体" w:hAnsi="黑体" w:eastAsia="黑体"/>
-                <w:b/>
-                <w:color w:val="FFFFFF"/>
-                <w:sz w:val="15"/>
-              </w:rPr>
-              <w:t>所在页码</w:t>
-            </w:r>
-          </w:p>
-        </w:tc>
-        <w:tc>
-          <w:tcPr>
-            <w:tcW w:w="2800" w:type="dxa"/>
-            <w:shd w:val="clear" w:color="auto" w:fill="1E3A8A"/>
-          </w:tcPr>
-          <w:p>
-            <w:pPr>
-              <w:spacing w:before="0" w:after="0" w:line="200" w:lineRule="auto"/>
-              <w:jc w:val="center"/>
-            </w:pPr>
-            <w:r>
-              <w:rPr>
-                <w:rFonts w:ascii="黑体" w:hAnsi="黑体" w:eastAsia="黑体"/>
-                <w:b/>
-                <w:color w:val="FFFFFF"/>
-                <w:sz w:val="15"/>
-              </w:rPr>
-              <w:t>章节编号与主题</w:t>
-            </w:r>
-          </w:p>
-        </w:tc>
-        <w:tc>
-          <w:tcPr>
-            <w:tcW w:w="1350" w:type="dxa"/>
-            <w:shd w:val="clear" w:color="auto" w:fill="1E3A8A"/>
-          </w:tcPr>
-          <w:p>
-            <w:pPr>
-              <w:spacing w:before="0" w:after="0" w:line="200" w:lineRule="auto"/>
-              <w:jc w:val="center"/>
-            </w:pPr>
-            <w:r>
-              <w:rPr>
-                <w:rFonts w:ascii="黑体" w:hAnsi="黑体" w:eastAsia="黑体"/>
-                <w:b/>
-                <w:color w:val="FFFFFF"/>
-                <w:sz w:val="15"/>
-              </w:rPr>
-              <w:t>所在页码</w:t>
-            </w:r>
-          </w:p>
-        </w:tc>
-      </w:tr>
-      <w:tr>
-        <w:tblPrEx>
-          <w:tblBorders>
-            <w:top w:val="single" w:color="1E293B" w:sz="8" w:space="0"/>
-            <w:left w:val="none" w:color="auto" w:sz="0" w:space="0"/>
-            <w:bottom w:val="single" w:color="1E293B" w:sz="8" w:space="0"/>
-            <w:right w:val="none" w:color="auto" w:sz="0" w:space="0"/>
-            <w:insideH w:val="single" w:color="E2E8F0" w:sz="4" w:space="0"/>
-            <w:insideV w:val="none" w:color="auto" w:sz="0" w:space="0"/>
-          </w:tblBorders>
-          <w:tblCellMar>
-            <w:top w:w="50" w:type="dxa"/>
-            <w:left w:w="50" w:type="dxa"/>
-            <w:bottom w:w="50" w:type="dxa"/>
-            <w:right w:w="50" w:type="dxa"/>
-          </w:tblCellMar>
-        </w:tblPrEx>
-        <w:tc>
-          <w:tcPr>
-            <w:tcW w:w="2800" w:type="dxa"/>
-          </w:tcPr>
-          <w:p>
-            <w:pPr>
-              <w:spacing w:before="0" w:after="0" w:line="200" w:lineRule="auto"/>
-              <w:jc w:val="left"/>
-            </w:pPr>
-            <w:r>
-              <w:rPr>
-                <w:rFonts w:ascii="Times New Roman" w:hAnsi="Times New Roman" w:eastAsia="宋体"/>
-                <w:sz w:val="15"/>
-              </w:rPr>
-              <w:t>一、摘要、目录与方法原则</w:t>
-            </w:r>
-          </w:p>
-        </w:tc>
-        <w:tc>
-          <w:tcPr>
-            <w:tcW w:w="1350" w:type="dxa"/>
-          </w:tcPr>
-          <w:p>
-            <w:pPr>
-              <w:spacing w:before="0" w:after="0" w:line="200" w:lineRule="auto"/>
-              <w:jc w:val="center"/>
-            </w:pPr>
-            <w:r>
-              <w:rPr>
-                <w:rFonts w:ascii="Times New Roman" w:hAnsi="Times New Roman" w:eastAsia="宋体"/>
-                <w:sz w:val="15"/>
-              </w:rPr>
-              <w:t>第 2 页</w:t>
-            </w:r>
-          </w:p>
-        </w:tc>
-        <w:tc>
-          <w:tcPr>
-            <w:tcW w:w="2800" w:type="dxa"/>
-          </w:tcPr>
-          <w:p>
-            <w:pPr>
-              <w:spacing w:before="0" w:after="0" w:line="200" w:lineRule="auto"/>
-              <w:jc w:val="center"/>
-            </w:pPr>
-            <w:r>
-              <w:rPr>
-                <w:rFonts w:ascii="Times New Roman" w:hAnsi="Times New Roman" w:eastAsia="宋体"/>
-                <w:sz w:val="15"/>
-              </w:rPr>
-              <w:t>六、完整测试集评估与逐类诊断</w:t>
-            </w:r>
-          </w:p>
-        </w:tc>
-        <w:tc>
-          <w:tcPr>
-            <w:tcW w:w="1350" w:type="dxa"/>
-          </w:tcPr>
-          <w:p>
-            <w:pPr>
-              <w:spacing w:before="0" w:after="0" w:line="200" w:lineRule="auto"/>
-              <w:jc w:val="center"/>
-            </w:pPr>
-            <w:r>
-              <w:rPr>
-                <w:rFonts w:ascii="Times New Roman" w:hAnsi="Times New Roman" w:eastAsia="宋体"/>
-                <w:sz w:val="15"/>
-              </w:rPr>
-              <w:t>第 7 页</w:t>
-            </w:r>
-          </w:p>
-        </w:tc>
-      </w:tr>
-      <w:tr>
-        <w:tblPrEx>
-          <w:tblBorders>
-            <w:top w:val="single" w:color="1E293B" w:sz="8" w:space="0"/>
-            <w:left w:val="none" w:color="auto" w:sz="0" w:space="0"/>
-            <w:bottom w:val="single" w:color="1E293B" w:sz="8" w:space="0"/>
-            <w:right w:val="none" w:color="auto" w:sz="0" w:space="0"/>
-            <w:insideH w:val="single" w:color="E2E8F0" w:sz="4" w:space="0"/>
-            <w:insideV w:val="none" w:color="auto" w:sz="0" w:space="0"/>
-          </w:tblBorders>
-          <w:tblCellMar>
-            <w:top w:w="50" w:type="dxa"/>
-            <w:left w:w="50" w:type="dxa"/>
-            <w:bottom w:w="50" w:type="dxa"/>
-            <w:right w:w="50" w:type="dxa"/>
-          </w:tblCellMar>
-        </w:tblPrEx>
-        <w:tc>
-          <w:tcPr>
-            <w:tcW w:w="2800" w:type="dxa"/>
-            <w:shd w:val="clear" w:color="auto" w:fill="F8FAFC"/>
-          </w:tcPr>
-          <w:p>
-            <w:pPr>
-              <w:spacing w:before="0" w:after="0" w:line="200" w:lineRule="auto"/>
-              <w:jc w:val="left"/>
-            </w:pPr>
-            <w:r>
-              <w:rPr>
-                <w:rFonts w:ascii="Times New Roman" w:hAnsi="Times New Roman" w:eastAsia="宋体"/>
-                <w:sz w:val="15"/>
-              </w:rPr>
-              <w:t>二、数据集划分、环境与指标</w:t>
-            </w:r>
-          </w:p>
-        </w:tc>
-        <w:tc>
-          <w:tcPr>
-            <w:tcW w:w="1350" w:type="dxa"/>
-            <w:shd w:val="clear" w:color="auto" w:fill="F8FAFC"/>
-          </w:tcPr>
-          <w:p>
-            <w:pPr>
-              <w:spacing w:before="0" w:after="0" w:line="200" w:lineRule="auto"/>
-              <w:jc w:val="center"/>
-            </w:pPr>
-            <w:r>
-              <w:rPr>
-                <w:rFonts w:ascii="Times New Roman" w:hAnsi="Times New Roman" w:eastAsia="宋体"/>
-                <w:sz w:val="15"/>
-              </w:rPr>
-              <w:t>第 3 页</w:t>
-            </w:r>
-          </w:p>
-        </w:tc>
-        <w:tc>
-          <w:tcPr>
-            <w:tcW w:w="2800" w:type="dxa"/>
-            <w:shd w:val="clear" w:color="auto" w:fill="F8FAFC"/>
-          </w:tcPr>
-          <w:p>
-            <w:pPr>
-              <w:spacing w:before="0" w:after="0" w:line="200" w:lineRule="auto"/>
-              <w:jc w:val="center"/>
-            </w:pPr>
-            <w:r>
-              <w:rPr>
-                <w:rFonts w:ascii="Times New Roman" w:hAnsi="Times New Roman" w:eastAsia="宋体"/>
-                <w:sz w:val="15"/>
-              </w:rPr>
-              <w:t>七、混淆矩阵深入诊断与错误归因</w:t>
-            </w:r>
-          </w:p>
-        </w:tc>
-        <w:tc>
-          <w:tcPr>
-            <w:tcW w:w="1350" w:type="dxa"/>
-            <w:shd w:val="clear" w:color="auto" w:fill="F8FAFC"/>
-          </w:tcPr>
-          <w:p>
-            <w:pPr>
-              <w:spacing w:before="0" w:after="0" w:line="200" w:lineRule="auto"/>
-              <w:jc w:val="center"/>
-            </w:pPr>
-            <w:r>
-              <w:rPr>
-                <w:rFonts w:ascii="Times New Roman" w:hAnsi="Times New Roman" w:eastAsia="宋体"/>
-                <w:sz w:val="15"/>
-              </w:rPr>
-              <w:t>第 8 页</w:t>
-            </w:r>
-          </w:p>
-        </w:tc>
-      </w:tr>
-      <w:tr>
-        <w:tblPrEx>
-          <w:tblBorders>
-            <w:top w:val="single" w:color="1E293B" w:sz="8" w:space="0"/>
-            <w:left w:val="none" w:color="auto" w:sz="0" w:space="0"/>
-            <w:bottom w:val="single" w:color="1E293B" w:sz="8" w:space="0"/>
-            <w:right w:val="none" w:color="auto" w:sz="0" w:space="0"/>
-            <w:insideH w:val="single" w:color="E2E8F0" w:sz="4" w:space="0"/>
-            <w:insideV w:val="none" w:color="auto" w:sz="0" w:space="0"/>
-          </w:tblBorders>
-          <w:tblCellMar>
-            <w:top w:w="50" w:type="dxa"/>
-            <w:left w:w="50" w:type="dxa"/>
-            <w:bottom w:w="50" w:type="dxa"/>
-            <w:right w:w="50" w:type="dxa"/>
-          </w:tblCellMar>
-        </w:tblPrEx>
-        <w:tc>
-          <w:tcPr>
-            <w:tcW w:w="2800" w:type="dxa"/>
-          </w:tcPr>
-          <w:p>
-            <w:pPr>
-              <w:spacing w:before="0" w:after="0" w:line="200" w:lineRule="auto"/>
-              <w:jc w:val="left"/>
-            </w:pPr>
-            <w:r>
-              <w:rPr>
-                <w:rFonts w:ascii="Times New Roman" w:hAnsi="Times New Roman" w:eastAsia="宋体"/>
-                <w:sz w:val="15"/>
-              </w:rPr>
-              <w:t>三、向量化实现与微基准对比</w:t>
-            </w:r>
-          </w:p>
-        </w:tc>
-        <w:tc>
-          <w:tcPr>
-            <w:tcW w:w="1350" w:type="dxa"/>
-          </w:tcPr>
-          <w:p>
-            <w:pPr>
-              <w:spacing w:before="0" w:after="0" w:line="200" w:lineRule="auto"/>
-              <w:jc w:val="center"/>
-            </w:pPr>
-            <w:r>
-              <w:rPr>
-                <w:rFonts w:ascii="Times New Roman" w:hAnsi="Times New Roman" w:eastAsia="宋体"/>
-                <w:sz w:val="15"/>
-              </w:rPr>
-              <w:t>第 4 页</w:t>
-            </w:r>
-          </w:p>
-        </w:tc>
-        <w:tc>
-          <w:tcPr>
-            <w:tcW w:w="2800" w:type="dxa"/>
-          </w:tcPr>
-          <w:p>
-            <w:pPr>
-              <w:spacing w:before="0" w:after="0" w:line="200" w:lineRule="auto"/>
-              <w:jc w:val="center"/>
-            </w:pPr>
-            <w:r>
-              <w:rPr>
-                <w:rFonts w:ascii="Times New Roman" w:hAnsi="Times New Roman" w:eastAsia="宋体"/>
-                <w:sz w:val="15"/>
-              </w:rPr>
-              <w:t>八、总结讨论、QA验证与工程复现</w:t>
-            </w:r>
-          </w:p>
-        </w:tc>
-        <w:tc>
-          <w:tcPr>
-            <w:tcW w:w="1350" w:type="dxa"/>
-          </w:tcPr>
-          <w:p>
-            <w:pPr>
-              <w:spacing w:before="0" w:after="0" w:line="200" w:lineRule="auto"/>
-              <w:jc w:val="center"/>
-            </w:pPr>
-            <w:r>
-              <w:rPr>
-                <w:rFonts w:ascii="Times New Roman" w:hAnsi="Times New Roman" w:eastAsia="宋体"/>
-                <w:sz w:val="15"/>
-              </w:rPr>
-              <w:t>第 9 页</w:t>
-            </w:r>
-          </w:p>
-        </w:tc>
-      </w:tr>
-      <w:tr>
-        <w:tblPrEx>
-          <w:tblBorders>
-            <w:top w:val="single" w:color="1E293B" w:sz="8" w:space="0"/>
-            <w:left w:val="none" w:color="auto" w:sz="0" w:space="0"/>
-            <w:bottom w:val="single" w:color="1E293B" w:sz="8" w:space="0"/>
-            <w:right w:val="none" w:color="auto" w:sz="0" w:space="0"/>
-            <w:insideH w:val="single" w:color="E2E8F0" w:sz="4" w:space="0"/>
-            <w:insideV w:val="none" w:color="auto" w:sz="0" w:space="0"/>
-          </w:tblBorders>
-          <w:tblCellMar>
-            <w:top w:w="50" w:type="dxa"/>
-            <w:left w:w="50" w:type="dxa"/>
-            <w:bottom w:w="50" w:type="dxa"/>
-            <w:right w:w="50" w:type="dxa"/>
-          </w:tblCellMar>
-        </w:tblPrEx>
-        <w:tc>
-          <w:tcPr>
-            <w:tcW w:w="2800" w:type="dxa"/>
-            <w:shd w:val="clear" w:color="auto" w:fill="F8FAFC"/>
-          </w:tcPr>
-          <w:p>
-            <w:pPr>
-              <w:spacing w:before="0" w:after="0" w:line="200" w:lineRule="auto"/>
-              <w:jc w:val="left"/>
-            </w:pPr>
-            <w:r>
-              <w:rPr>
-                <w:rFonts w:ascii="Times New Roman" w:hAnsi="Times New Roman" w:eastAsia="宋体"/>
-                <w:sz w:val="15"/>
-              </w:rPr>
-              <w:t>四、100 组网格搜索消融规律</w:t>
-            </w:r>
-          </w:p>
-        </w:tc>
-        <w:tc>
-          <w:tcPr>
-            <w:tcW w:w="1350" w:type="dxa"/>
-            <w:shd w:val="clear" w:color="auto" w:fill="F8FAFC"/>
-          </w:tcPr>
-          <w:p>
-            <w:pPr>
-              <w:spacing w:before="0" w:after="0" w:line="200" w:lineRule="auto"/>
-              <w:jc w:val="center"/>
-            </w:pPr>
-            <w:r>
-              <w:rPr>
-                <w:rFonts w:ascii="Times New Roman" w:hAnsi="Times New Roman" w:eastAsia="宋体"/>
-                <w:sz w:val="15"/>
-              </w:rPr>
-              <w:t>第 5 页</w:t>
-            </w:r>
-          </w:p>
-        </w:tc>
-        <w:tc>
-          <w:tcPr>
-            <w:tcW w:w="2800" w:type="dxa"/>
-            <w:shd w:val="clear" w:color="auto" w:fill="F8FAFC"/>
-          </w:tcPr>
-          <w:p>
-            <w:pPr>
-              <w:spacing w:before="0" w:after="0" w:line="200" w:lineRule="auto"/>
-              <w:jc w:val="center"/>
-            </w:pPr>
-            <w:r>
-              <w:rPr>
-                <w:rFonts w:ascii="Times New Roman" w:hAnsi="Times New Roman" w:eastAsia="宋体"/>
-                <w:sz w:val="15"/>
-              </w:rPr>
-              <w:t>九、开源工程仓库与在线交互报告</w:t>
-            </w:r>
-          </w:p>
-        </w:tc>
-        <w:tc>
-          <w:tcPr>
-            <w:tcW w:w="1350" w:type="dxa"/>
-            <w:shd w:val="clear" w:color="auto" w:fill="F8FAFC"/>
-          </w:tcPr>
-          <w:p>
-            <w:pPr>
-              <w:spacing w:before="0" w:after="0" w:line="200" w:lineRule="auto"/>
-              <w:jc w:val="center"/>
-            </w:pPr>
-            <w:r>
-              <w:rPr>
-                <w:rFonts w:ascii="Times New Roman" w:hAnsi="Times New Roman" w:eastAsia="宋体"/>
-                <w:sz w:val="15"/>
-              </w:rPr>
-              <w:t>第 10 页</w:t>
-            </w:r>
-          </w:p>
-        </w:tc>
-      </w:tr>
-      <w:tr>
-        <w:tblPrEx>
-          <w:tblBorders>
-            <w:top w:val="single" w:color="1E293B" w:sz="8" w:space="0"/>
-            <w:left w:val="none" w:color="auto" w:sz="0" w:space="0"/>
-            <w:bottom w:val="single" w:color="1E293B" w:sz="8" w:space="0"/>
-            <w:right w:val="none" w:color="auto" w:sz="0" w:space="0"/>
-            <w:insideH w:val="single" w:color="E2E8F0" w:sz="4" w:space="0"/>
-            <w:insideV w:val="none" w:color="auto" w:sz="0" w:space="0"/>
-          </w:tblBorders>
-          <w:tblCellMar>
-            <w:top w:w="50" w:type="dxa"/>
-            <w:left w:w="50" w:type="dxa"/>
-            <w:bottom w:w="50" w:type="dxa"/>
-            <w:right w:w="50" w:type="dxa"/>
-          </w:tblCellMar>
-        </w:tblPrEx>
-        <w:tc>
-          <w:tcPr>
-            <w:tcW w:w="2800" w:type="dxa"/>
-          </w:tcPr>
-          <w:p>
-            <w:pPr>
-              <w:spacing w:before="0" w:after="0" w:line="200" w:lineRule="auto"/>
-              <w:jc w:val="left"/>
-            </w:pPr>
-            <w:r>
-              <w:rPr>
-                <w:rFonts w:ascii="Times New Roman" w:hAnsi="Times New Roman" w:eastAsia="宋体"/>
-                <w:sz w:val="15"/>
-              </w:rPr>
-              <w:t>五、图像特征探索与降维对比</w:t>
-            </w:r>
-          </w:p>
-        </w:tc>
-        <w:tc>
-          <w:tcPr>
-            <w:tcW w:w="1350" w:type="dxa"/>
-          </w:tcPr>
-          <w:p>
-            <w:pPr>
-              <w:spacing w:before="0" w:after="0" w:line="200" w:lineRule="auto"/>
-              <w:jc w:val="center"/>
-            </w:pPr>
-            <w:r>
-              <w:rPr>
-                <w:rFonts w:ascii="Times New Roman" w:hAnsi="Times New Roman" w:eastAsia="宋体"/>
-                <w:sz w:val="15"/>
-              </w:rPr>
-              <w:t>第 6 页</w:t>
-            </w:r>
-          </w:p>
-        </w:tc>
-        <w:tc>
-          <w:tcPr>
-            <w:tcW w:w="2800" w:type="dxa"/>
-          </w:tcPr>
-          <w:p>
-            <w:pPr>
-              <w:spacing w:before="0" w:after="0" w:line="200" w:lineRule="auto"/>
-              <w:jc w:val="center"/>
-            </w:pPr>
-            <w:r>
-              <w:rPr>
-                <w:rFonts w:ascii="Times New Roman" w:hAnsi="Times New Roman" w:eastAsia="宋体"/>
-                <w:sz w:val="15"/>
-              </w:rPr>
-              <w:t>附录：在线网站与扫码查验系统</w:t>
-            </w:r>
-          </w:p>
-        </w:tc>
-        <w:tc>
-          <w:tcPr>
-            <w:tcW w:w="1350" w:type="dxa"/>
-          </w:tcPr>
-          <w:p>
-            <w:pPr>
-              <w:spacing w:before="0" w:after="0" w:line="200" w:lineRule="auto"/>
-              <w:jc w:val="center"/>
-            </w:pPr>
-            <w:r>
-              <w:rPr>
-                <w:rFonts w:ascii="Times New Roman" w:hAnsi="Times New Roman" w:eastAsia="宋体"/>
-                <w:sz w:val="15"/>
-              </w:rPr>
-              <w:t>第 10 页</w:t>
-            </w:r>
-          </w:p>
-        </w:tc>
-      </w:tr>
-    </w:tbl>
-    <w:p>
-      <w:pPr>
-        <w:spacing w:after="30" w:line="240" w:lineRule="auto"/>
-        <w:jc w:val="left"/>
-      </w:pPr>
-    </w:p>
-    <w:p>
-      <w:pPr>
-        <w:spacing w:after="40" w:line="240" w:lineRule="auto"/>
-        <w:jc w:val="left"/>
-      </w:pPr>
-      <w:r>
-        <w:rPr>
-          <w:rFonts w:ascii="黑体" w:hAnsi="黑体" w:eastAsia="黑体"/>
-          <w:b/>
-          <w:color w:val="0F172A"/>
-          <w:sz w:val="21"/>
-          <w:szCs w:val="21"/>
-        </w:rPr>
-        <w:t>1.2 核心算法设计与数学契约</w:t>
+        <w:t>1.1 核心算法设计与数学契约</w:t>
       </w:r>
     </w:p>
     <w:p>
@@ -1852,8 +1948,8 @@
         </w:rPr>
         <w:drawing>
           <wp:inline distT="0" distB="0" distL="0" distR="0">
-            <wp:extent cx="3810000" cy="410845"/>
-            <wp:effectExtent l="0" t="0" r="0" b="635"/>
+            <wp:extent cx="4191000" cy="451485"/>
+            <wp:effectExtent l="0" t="0" r="0" b="5080"/>
             <wp:docPr id="101" name="eq_l2.png"/>
             <wp:cNvGraphicFramePr/>
             <a:graphic xmlns:a="http://schemas.openxmlformats.org/drawingml/2006/main">
@@ -1872,7 +1968,7 @@
                   <pic:spPr>
                     <a:xfrm>
                       <a:off x="0" y="0"/>
-                      <a:ext cx="3810000" cy="410966"/>
+                      <a:ext cx="4191000" cy="452062"/>
                     </a:xfrm>
                     <a:prstGeom prst="rect">
                       <a:avLst/>
@@ -1919,8 +2015,8 @@
         </w:rPr>
         <w:drawing>
           <wp:inline distT="0" distB="0" distL="0" distR="0">
-            <wp:extent cx="1524000" cy="458470"/>
-            <wp:effectExtent l="0" t="0" r="0" b="13970"/>
+            <wp:extent cx="1651000" cy="496570"/>
+            <wp:effectExtent l="0" t="0" r="10160" b="5715"/>
             <wp:docPr id="102" name="eq_weight.png"/>
             <wp:cNvGraphicFramePr/>
             <a:graphic xmlns:a="http://schemas.openxmlformats.org/drawingml/2006/main">
@@ -1939,7 +2035,7 @@
                   <pic:spPr>
                     <a:xfrm>
                       <a:off x="0" y="0"/>
-                      <a:ext cx="1524000" cy="458931"/>
+                      <a:ext cx="1651000" cy="497176"/>
                     </a:xfrm>
                     <a:prstGeom prst="rect">
                       <a:avLst/>
@@ -1970,7 +2066,7 @@
           <w:sz w:val="19"/>
           <w:szCs w:val="19"/>
         </w:rPr>
-        <w:t>最终多数票决策目标函数如下（式中 I 为指示函数）：</w:t>
+        <w:t>最终多数票决策目标函数如下：</w:t>
       </w:r>
     </w:p>
     <w:p>
@@ -1986,8 +2082,8 @@
         </w:rPr>
         <w:drawing>
           <wp:inline distT="0" distB="0" distL="0" distR="0">
-            <wp:extent cx="3683000" cy="798195"/>
-            <wp:effectExtent l="0" t="0" r="5080" b="9525"/>
+            <wp:extent cx="4064000" cy="880745"/>
+            <wp:effectExtent l="0" t="0" r="5080" b="3175"/>
             <wp:docPr id="103" name="eq_vote.png"/>
             <wp:cNvGraphicFramePr/>
             <a:graphic xmlns:a="http://schemas.openxmlformats.org/drawingml/2006/main">
@@ -2006,7 +2102,7 @@
                   <pic:spPr>
                     <a:xfrm>
                       <a:off x="0" y="0"/>
-                      <a:ext cx="3683000" cy="798384"/>
+                      <a:ext cx="4064000" cy="880976"/>
                     </a:xfrm>
                     <a:prstGeom prst="rect">
                       <a:avLst/>
@@ -2037,7 +2133,22 @@
           <w:sz w:val="19"/>
           <w:szCs w:val="19"/>
         </w:rPr>
-        <w:t>• 确定性平票仲裁：近邻检索并列优先保留训练行号较小样本；多数票统计并列严格判定为类别编号较小者（0-9）。</w:t>
+        <w:t>• 确定性双层平票仲裁：近邻检索并列优先保留训练行号较小样本；多数票统计并列严格判定为类别编号较小者（0-9），契合课程标准。</w:t>
+      </w:r>
+    </w:p>
+    <w:p>
+      <w:pPr>
+        <w:spacing w:after="40" w:line="240" w:lineRule="auto"/>
+        <w:ind w:firstLine="380" w:firstLineChars="200"/>
+        <w:jc w:val="left"/>
+      </w:pPr>
+      <w:r>
+        <w:rPr>
+          <w:rFonts w:ascii="Times New Roman" w:hAnsi="Times New Roman" w:eastAsia="宋体"/>
+          <w:sz w:val="19"/>
+          <w:szCs w:val="19"/>
+        </w:rPr>
+        <w:t>• Top-n 精度口径：按投票得分降序、类别编号升序排序，未获票类别得分归零后按编号补位，避免虚构高置信候选。</w:t>
       </w:r>
     </w:p>
     <w:p>
@@ -2573,6 +2684,21 @@
           <w:szCs w:val="19"/>
         </w:rPr>
         <w:t>建立多维客观评价指标：Top-1 准确率、Top-3/Top-5 覆盖率（真实标签出现在前 3/5 个候选类的比例）、10×10 混淆矩阵，以及宏平均 Macro-F1（平衡各类精度）。精确测时特征变换、近邻检索与投票过程。</w:t>
+      </w:r>
+    </w:p>
+    <w:p>
+      <w:pPr>
+        <w:spacing w:after="40" w:line="240" w:lineRule="auto"/>
+        <w:ind w:firstLine="380" w:firstLineChars="200"/>
+        <w:jc w:val="left"/>
+      </w:pPr>
+      <w:r>
+        <w:rPr>
+          <w:rFonts w:ascii="Times New Roman" w:hAnsi="Times New Roman" w:eastAsia="宋体"/>
+          <w:sz w:val="19"/>
+          <w:szCs w:val="19"/>
+        </w:rPr>
+        <w:t>• 科学评估防泄漏原则：在整个 100 组网格搜索探索阶段，全量 10,000 张独立测试集完全保持不可见；特征工程（如 PCA 均值向量与投影基矩阵）严格仅在 12,000 张训练子集上拟合，验证集与测试集仅应用已训练变换，杜绝任何形式的全局统计信息泄露。</w:t>
       </w:r>
     </w:p>
     <w:p>
@@ -4355,6 +4481,22 @@
     <w:p>
       <w:pPr>
         <w:spacing w:after="40" w:line="240" w:lineRule="auto"/>
+        <w:jc w:val="left"/>
+      </w:pPr>
+      <w:r>
+        <w:rPr>
+          <w:rFonts w:ascii="黑体" w:hAnsi="黑体" w:eastAsia="黑体"/>
+          <w:b/>
+          <w:color w:val="0F172A"/>
+          <w:sz w:val="21"/>
+          <w:szCs w:val="21"/>
+        </w:rPr>
+        <w:t>4.2 超参数敏感度与消融分析</w:t>
+      </w:r>
+    </w:p>
+    <w:p>
+      <w:pPr>
+        <w:spacing w:after="40" w:line="240" w:lineRule="auto"/>
         <w:ind w:firstLine="380" w:firstLineChars="200"/>
         <w:jc w:val="left"/>
       </w:pPr>
@@ -4364,7 +4506,22 @@
           <w:sz w:val="19"/>
           <w:szCs w:val="19"/>
         </w:rPr>
-        <w:t>k 过小易受噪点影响过拟合；k 过大决策平滑欠拟合。在 HOG 特征下，k=5 取得 96.00% 最高验证率，有效平衡了局部判别力与抗噪鲁棒性。</w:t>
+        <w:t>• k 值敏感度：k=1 时易受孤立噪点影响发生过拟合；k 过大（k=7, 9）决策面过度平滑导致欠拟合。在 HOG 特征下，k=5 取得 96.00% 最高验证率，有效平衡了局部判别力与抗噪鲁棒性。</w:t>
+      </w:r>
+    </w:p>
+    <w:p>
+      <w:pPr>
+        <w:spacing w:after="40" w:line="240" w:lineRule="auto"/>
+        <w:ind w:firstLine="380" w:firstLineChars="200"/>
+        <w:jc w:val="left"/>
+      </w:pPr>
+      <w:r>
+        <w:rPr>
+          <w:rFonts w:ascii="Times New Roman" w:hAnsi="Times New Roman" w:eastAsia="宋体"/>
+          <w:sz w:val="19"/>
+          <w:szCs w:val="19"/>
+        </w:rPr>
+        <w:t>• 距离度量与加权对比：欧氏距离（L2）在连续梯度空间中的判别边界更为平滑，平均准确率略高于曼哈顿距离；当 k 增至 7 或 9 时，距离倒数加权赋予最近邻更高置信度，有效抑制了远距离边界样本的投票干扰。</w:t>
       </w:r>
     </w:p>
     <w:p>
@@ -5189,6 +5346,22 @@
     <w:p>
       <w:pPr>
         <w:spacing w:after="40" w:line="240" w:lineRule="auto"/>
+        <w:jc w:val="left"/>
+      </w:pPr>
+      <w:r>
+        <w:rPr>
+          <w:rFonts w:ascii="黑体" w:hAnsi="黑体" w:eastAsia="黑体"/>
+          <w:b/>
+          <w:color w:val="0F172A"/>
+          <w:sz w:val="21"/>
+          <w:szCs w:val="21"/>
+        </w:rPr>
+        <w:t>5.2 特征表征能力与计算复杂度权衡</w:t>
+      </w:r>
+    </w:p>
+    <w:p>
+      <w:pPr>
+        <w:spacing w:after="40" w:line="240" w:lineRule="auto"/>
         <w:ind w:firstLine="380" w:firstLineChars="200"/>
         <w:jc w:val="left"/>
       </w:pPr>
@@ -5198,7 +5371,22 @@
           <w:sz w:val="19"/>
           <w:szCs w:val="19"/>
         </w:rPr>
-        <w:t>PCA-50 仅用 50 维即反超 784 维原始像素；HOG 凭借 9 方向局部梯度对笔画形变的强几何不变性取得最优表现。因此最终配置锁定为 HOG、324 维、L2、k=5、均匀投票。</w:t>
+        <w:t>• 降维去噪机制：原始 784 维像素存在高度空间冗余及高频背景噪声；PCA 投影通过正交分解去除了非主方向方差，50 维特征不仅降低了 93.6% 的距离计算量，分类精度反提升 0.85%。</w:t>
+      </w:r>
+    </w:p>
+    <w:p>
+      <w:pPr>
+        <w:spacing w:after="40" w:line="240" w:lineRule="auto"/>
+        <w:ind w:firstLine="380" w:firstLineChars="200"/>
+        <w:jc w:val="left"/>
+      </w:pPr>
+      <w:r>
+        <w:rPr>
+          <w:rFonts w:ascii="Times New Roman" w:hAnsi="Times New Roman" w:eastAsia="宋体"/>
+          <w:sz w:val="19"/>
+          <w:szCs w:val="19"/>
+        </w:rPr>
+        <w:t>• 局部梯度几何不变性：手写数字存在笔画粗细不均、轻度倾斜与平移扭曲等问题；HOG 特征统计局部方向梯度直方图，对笔画连续性与拓扑形态具有极佳的尺度与几何不变性，从而获得 96.00% 的最高验证表现。因此最终配置锁定为 HOG、324 维、L2、k=5、均匀投票。</w:t>
       </w:r>
     </w:p>
     <w:p>
@@ -7203,7 +7391,7 @@
           <w:sz w:val="28"/>
           <w:szCs w:val="28"/>
         </w:rPr>
-        <w:t>八、总结讨论、算法 QA 验证与工程复现</w:t>
+        <w:t>八、总结讨论、QA 验证、工程复现与开源系统</w:t>
       </w:r>
     </w:p>
     <w:p>
@@ -7583,7 +7771,7 @@
           <w:sz w:val="21"/>
           <w:szCs w:val="21"/>
         </w:rPr>
-        <w:t>8.2 作业工程复现说明</w:t>
+        <w:t>8.2 作业工程复现指南与开源系统</w:t>
       </w:r>
     </w:p>
     <w:p>
@@ -7598,7 +7786,7 @@
           <w:sz w:val="19"/>
           <w:szCs w:val="19"/>
         </w:rPr>
-        <w:t>为保证实验严谨与结论可查，全部源代码均包含独立单元测试与哈希指纹校验：</w:t>
+        <w:t>• 环境与复现：Python 3.11+ / PyTorch 2.2 / NumPy 1.26 / scikit-learn。运行 python run.py 执行全流程，运行 python qa.py 执行 11 项算法 QA 单元测试。</w:t>
       </w:r>
     </w:p>
     <w:p>
@@ -7613,57 +7801,7 @@
           <w:sz w:val="19"/>
           <w:szCs w:val="19"/>
         </w:rPr>
-        <w:t>• 环境要求：Python 3.11+ / PyTorch 2.2 / NumPy 1.26 / scikit-learn / scikit-image。</w:t>
-      </w:r>
-    </w:p>
-    <w:p>
-      <w:pPr>
-        <w:spacing w:after="40" w:line="240" w:lineRule="auto"/>
-        <w:ind w:firstLine="380" w:firstLineChars="200"/>
-        <w:jc w:val="left"/>
-      </w:pPr>
-      <w:r>
-        <w:rPr>
-          <w:rFonts w:ascii="Times New Roman" w:hAnsi="Times New Roman" w:eastAsia="宋体"/>
-          <w:sz w:val="19"/>
-          <w:szCs w:val="19"/>
-        </w:rPr>
-        <w:t>• 一键复现：运行 python run.py 执行全流程，运行 python qa.py 执行 11 项算法 QA 单元测试。</w:t>
-      </w:r>
-    </w:p>
-    <w:p>
-      <w:pPr>
-        <w:pageBreakBefore/>
-        <w:pBdr>
-          <w:bottom w:val="single" w:color="1E3A8A" w:sz="12" w:space="4"/>
-        </w:pBdr>
-        <w:spacing w:after="100" w:line="240" w:lineRule="auto"/>
-        <w:jc w:val="left"/>
-      </w:pPr>
-      <w:r>
-        <w:rPr>
-          <w:rFonts w:ascii="黑体" w:hAnsi="黑体" w:eastAsia="黑体"/>
-          <w:b/>
-          <w:color w:val="0F172A"/>
-          <w:sz w:val="28"/>
-          <w:szCs w:val="28"/>
-        </w:rPr>
-        <w:t>九、开源工程仓库与在线交互报告</w:t>
-      </w:r>
-    </w:p>
-    <w:p>
-      <w:pPr>
-        <w:spacing w:after="40" w:line="240" w:lineRule="auto"/>
-        <w:ind w:firstLine="380" w:firstLineChars="200"/>
-        <w:jc w:val="left"/>
-      </w:pPr>
-      <w:r>
-        <w:rPr>
-          <w:rFonts w:ascii="Times New Roman" w:hAnsi="Times New Roman" w:eastAsia="宋体"/>
-          <w:sz w:val="19"/>
-          <w:szCs w:val="19"/>
-        </w:rPr>
-        <w:t>为方便老师全方位审阅本次课程设计的完整实现、交互式检视 100 组超参数消融曲线并查验算法源代码，我已将全部源码、原始实验数据包及说明文档开源托管至 GitHub，并搭建了无依赖的 GitHub Pages 在线静态网站：</w:t>
+        <w:t>• 开源交互报告系统：为方便老师审阅本次课程设计的完整实现并交互式检视 100 组超参数消融曲线，我已将全部源码托管至 GitHub 并搭建了 GitHub Pages 在线静态网站：</w:t>
       </w:r>
     </w:p>
     <w:p>
@@ -7679,8 +7817,8 @@
         </w:rPr>
         <w:drawing>
           <wp:inline distT="0" distB="0" distL="0" distR="0">
-            <wp:extent cx="5842000" cy="3397250"/>
-            <wp:effectExtent l="0" t="0" r="10160" b="1270"/>
+            <wp:extent cx="4826000" cy="2806700"/>
+            <wp:effectExtent l="0" t="0" r="5080" b="12700"/>
             <wp:docPr id="108" name="editorial_report_showcase.png"/>
             <wp:cNvGraphicFramePr/>
             <a:graphic xmlns:a="http://schemas.openxmlformats.org/drawingml/2006/main">
@@ -7699,7 +7837,7 @@
                   <pic:spPr>
                     <a:xfrm>
                       <a:off x="0" y="0"/>
-                      <a:ext cx="5842000" cy="3397757"/>
+                      <a:ext cx="4826000" cy="2806843"/>
                     </a:xfrm>
                     <a:prstGeom prst="rect">
                       <a:avLst/>
@@ -7821,8 +7959,8 @@
             <w:r>
               <w:drawing>
                 <wp:inline distT="0" distB="0" distL="0" distR="0">
-                  <wp:extent cx="1079500" cy="1079500"/>
-                  <wp:effectExtent l="0" t="0" r="2540" b="2540"/>
+                  <wp:extent cx="1016000" cy="1016000"/>
+                  <wp:effectExtent l="0" t="0" r="5080" b="5080"/>
                   <wp:docPr id="109" name="website_qr.png"/>
                   <wp:cNvGraphicFramePr/>
                   <a:graphic xmlns:a="http://schemas.openxmlformats.org/drawingml/2006/main">
@@ -7841,7 +7979,7 @@
                         <pic:spPr>
                           <a:xfrm>
                             <a:off x="0" y="0"/>
-                            <a:ext cx="1079500" cy="1079500"/>
+                            <a:ext cx="1016000" cy="1016000"/>
                           </a:xfrm>
                           <a:prstGeom prst="rect">
                             <a:avLst/>

</xml_diff>